<commit_message>
add src2 as new new src
</commit_message>
<xml_diff>
--- a/docs/TCASP_Summary.docx
+++ b/docs/TCASP_Summary.docx
@@ -4,17 +4,11 @@
   <w:body>
     <w:p>
       <w:pPr>
+        <w:pStyle w:val="Title"/>
         <w:jc w:val="center"/>
       </w:pPr>
       <w:r>
-        <w:rPr>
-          <w:rFonts w:ascii="Tahoma" w:hAnsi="Tahoma" w:cs="Tahoma"/>
-          <w:b/>
-          <w:color w:val="1F3B57"/>
-          <w:sz w:val="56"/>
-          <w:szCs w:val="56"/>
-        </w:rPr>
-        <w:t>TCASP</w:t>
+        <w:t>TCASP – Traffic Control Avoidance System Protocol</w:t>
       </w:r>
     </w:p>
     <w:p>
@@ -23,26 +17,10 @@
       </w:pPr>
       <w:r>
         <w:rPr>
-          <w:rFonts w:ascii="Tahoma" w:hAnsi="Tahoma" w:cs="Tahoma"/>
-          <w:color w:val="555555"/>
-          <w:sz w:val="26"/>
-          <w:szCs w:val="26"/>
+          <w:color w:val="646464"/>
+          <w:sz w:val="28"/>
         </w:rPr>
-        <w:t>Traffic Control Avoidance System Protocol</w:t>
-      </w:r>
-    </w:p>
-    <w:p>
-      <w:pPr>
-        <w:jc w:val="center"/>
-      </w:pPr>
-      <w:r>
-        <w:rPr>
-          <w:rFonts w:ascii="Tahoma" w:hAnsi="Tahoma" w:cs="Tahoma"/>
-          <w:color w:val="777777"/>
-          <w:sz w:val="22"/>
-          <w:szCs w:val="22"/>
-        </w:rPr>
-        <w:t>โปรโตคอลจำลองระบบเตือนการชนกันของอากาศยานบน UDP</w:t>
+        <w:t>Mini Project 1 – วิชา Network Programming (01418351)</w:t>
       </w:r>
     </w:p>
     <w:p/>
@@ -51,20 +29,66 @@
         <w:pStyle w:val="Heading1"/>
       </w:pPr>
       <w:r>
-        <w:rPr>
-          <w:rFonts w:ascii="Tahoma" w:hAnsi="Tahoma" w:cs="Tahoma"/>
-          <w:szCs w:val="30"/>
-        </w:rPr>
-        <w:t>1. ภาพรวม</w:t>
+        <w:t>1. ภาพรวมของแอปพลิเคชัน</w:t>
+      </w:r>
+    </w:p>
+    <w:p>
+      <w:r>
+        <w:t>TCASP (Traffic Control Avoidance System Protocol) คือระบบจำลองการป้องกันการชนกันของเครื่องบินกลางอากาศ ที่ได้แรงบันดาลใจมาจากระบบ TCAS (Traffic Collision Avoidance System) ที่ใช้งานจริงในอุตสาหกรรมการบิน แอปพลิเคชันนี้ใช้สถาปัตยกรรมแบบ Client-Server ผ่านโปรโตคอล UDP โดยแต่ละ Client จะจำลองเป็นเครื่องบิน 1 ลำ ที่ส่งพิกัดตำแหน่ง 3 มิติไปยัง Server กลางเป็นระยะๆ จากนั้น Server จะคำนวณระยะห่างระหว่างเครื่องบินทุกคู่ แล้วออกคำแนะนำ (Advisory) ที่เหมาะสม ได้แก่ CLEAR, TA, RA หรือ CRASH</w:t>
+      </w:r>
+    </w:p>
+    <w:p>
+      <w:pPr>
+        <w:pStyle w:val="Heading1"/>
+      </w:pPr>
+      <w:r>
+        <w:t>2. Transport Layer: ทำไมถึงเลือก UDP?</w:t>
+      </w:r>
+    </w:p>
+    <w:p>
+      <w:r>
+        <w:t>TCASP ต้องการการส่งข้อมูลแบบ Real-time และความเร็วสูง เราจึงเลือกใช้ UDP แทน TCP ด้วยเหตุผลดังต่อไปนี้:</w:t>
       </w:r>
     </w:p>
     <w:p>
       <w:r>
         <w:rPr>
-          <w:rFonts w:ascii="Tahoma" w:hAnsi="Tahoma" w:cs="Tahoma"/>
-          <w:szCs w:val="21"/>
+          <w:b/>
         </w:rPr>
-        <w:t>TCASP เป็นโปรโตคอลชั้น Application ที่ออกแบบขึ้นเพื่อจำลองการทำงานของระบบ TCAS (Traffic Collision Avoidance System) โดยเครื่องบินแต่ละลำ (client) รายงานตำแหน่งตัวเอง เข้ามายังศูนย์ควบคุม (server) เป็นระยะ แล้ว server จะประเมินความเสี่ยงการชน และตอบกลับเป็นคำสั่งหลบหลีกให้เครื่องบินที่เกี่ยวข้อง</w:t>
+        <w:t xml:space="preserve">• Low Latency (ความหน่วงต่ำ): </w:t>
+      </w:r>
+      <w:r>
+        <w:t>ไม่ต้องเสียเวลาทำ 3-Way Handshake ในระบบป้องกันการชนกัน ทุกมิลลิวินาทีมีความสำคัญ</w:t>
+      </w:r>
+    </w:p>
+    <w:p>
+      <w:r>
+        <w:rPr>
+          <w:b/>
+        </w:rPr>
+        <w:t xml:space="preserve">• Tolerance to Packet Loss (ทนต่อการสูญหายของ Packet): </w:t>
+      </w:r>
+      <w:r>
+        <w:t>ถ้า Packet พิกัดหายไป ข้อมูลนั้นก็เก่าไปแล้ว PING ถัดไปจะมีพิกัดที่ใหม่กว่า การที่ TCP พยายาม Retransmit ข้อมูลเก่าจึงไม่มีประโยชน์</w:t>
+      </w:r>
+    </w:p>
+    <w:p>
+      <w:r>
+        <w:rPr>
+          <w:b/>
+        </w:rPr>
+        <w:t xml:space="preserve">• No Head-of-Line Blocking (ไม่มีการบล็อคคิว): </w:t>
+      </w:r>
+      <w:r>
+        <w:t>UDP ไม่บังคับให้ Packet ใหม่ต้องรอ Packet เก่าที่หายไป ทำให้ข้อมูลล่าสุดถึงปลายทางได้ทันที</w:t>
+      </w:r>
+    </w:p>
+    <w:p>
+      <w:pPr>
+        <w:pStyle w:val="Heading1"/>
+      </w:pPr>
+      <w:r>
+        <w:t>3. การออกแบบ Protocol</w:t>
       </w:r>
     </w:p>
     <w:p>
@@ -72,108 +96,63 @@
         <w:pStyle w:val="Heading2"/>
       </w:pPr>
       <w:r>
-        <w:rPr>
-          <w:rFonts w:ascii="Tahoma" w:hAnsi="Tahoma" w:cs="Tahoma"/>
-          <w:szCs w:val="25"/>
-        </w:rPr>
-        <w:t>เหตุผลที่เลือก UDP</w:t>
+        <w:t>3.1 รูปแบบ Request (Client → Server)</w:t>
       </w:r>
     </w:p>
     <w:p>
       <w:pPr>
-        <w:pStyle w:val="ListBullet"/>
+        <w:pStyle w:val="IntenseQuote"/>
       </w:pPr>
       <w:r>
-        <w:rPr>
-          <w:rFonts w:ascii="Tahoma" w:hAnsi="Tahoma" w:cs="Tahoma"/>
-          <w:b w:val="0"/>
-          <w:szCs w:val="21"/>
-        </w:rPr>
-        <w:t xml:space="preserve">ข้อมูลตำแหน่งเป็น </w:t>
-      </w:r>
-      <w:r>
-        <w:rPr>
-          <w:rFonts w:ascii="Tahoma" w:hAnsi="Tahoma" w:cs="Tahoma"/>
-          <w:b/>
-          <w:szCs w:val="21"/>
-        </w:rPr>
-        <w:t>real-time state update</w:t>
-      </w:r>
-      <w:r>
-        <w:rPr>
-          <w:rFonts w:ascii="Tahoma" w:hAnsi="Tahoma" w:cs="Tahoma"/>
-          <w:b w:val="0"/>
-          <w:szCs w:val="21"/>
-        </w:rPr>
-        <w:t xml:space="preserve"> — ข้อมูลรอบใหม่ทับข้อมูลรอบเก่าได้ทันที การสูญหายของ datagram หนึ่งไม่เสียหาย เพราะรอบถัดไปจะส่งค่าล่าสุดมาอีกใน 2 วินาที</w:t>
+        <w:t>TCASP/&lt;version&gt; PING &lt;seq_no&gt; &lt;flight_ID&gt; &lt;posX&gt; &lt;posY&gt; &lt;posZ&gt;</w:t>
       </w:r>
     </w:p>
     <w:p>
-      <w:pPr>
-        <w:pStyle w:val="ListBullet"/>
-      </w:pPr>
       <w:r>
-        <w:rPr>
-          <w:rFonts w:ascii="Tahoma" w:hAnsi="Tahoma" w:cs="Tahoma"/>
-          <w:b w:val="0"/>
-          <w:szCs w:val="21"/>
-        </w:rPr>
-        <w:t>ไม่ต้องเสียเวลา handshake และ retransmission แบบ TCP ซึ่งจะทำให้ข้อมูลที่ได้ล้าหลังความจริง</w:t>
-      </w:r>
-    </w:p>
-    <w:p>
-      <w:pPr>
-        <w:pStyle w:val="ListBullet"/>
-      </w:pPr>
-      <w:r>
-        <w:rPr>
-          <w:rFonts w:ascii="Tahoma" w:hAnsi="Tahoma" w:cs="Tahoma"/>
-          <w:b w:val="0"/>
-          <w:szCs w:val="21"/>
-        </w:rPr>
-        <w:t xml:space="preserve">รองรับการ </w:t>
-      </w:r>
-      <w:r>
-        <w:rPr>
-          <w:rFonts w:ascii="Tahoma" w:hAnsi="Tahoma" w:cs="Tahoma"/>
-          <w:b/>
-          <w:szCs w:val="21"/>
-        </w:rPr>
-        <w:t>broadcast</w:t>
-      </w:r>
-      <w:r>
-        <w:rPr>
-          <w:rFonts w:ascii="Tahoma" w:hAnsi="Tahoma" w:cs="Tahoma"/>
-          <w:b w:val="0"/>
-          <w:szCs w:val="21"/>
-        </w:rPr>
-        <w:t xml:space="preserve"> ไปยังหลายเครื่องพร้อมกันได้ตรงไปตรงมา ซึ่งจำเป็นตอนออกคำสั่ง RA คู่กัน</w:t>
-      </w:r>
-    </w:p>
-    <w:p>
-      <w:pPr>
-        <w:pStyle w:val="Heading1"/>
-      </w:pPr>
-      <w:r>
-        <w:rPr>
-          <w:rFonts w:ascii="Tahoma" w:hAnsi="Tahoma" w:cs="Tahoma"/>
-          <w:szCs w:val="30"/>
-        </w:rPr>
-        <w:t>2. ระบบพิกัด</w:t>
+        <w:t>ตัวอย่าง: TCASP/1.0 PING 1 TG611 -4.0 32000.0 0.0</w:t>
       </w:r>
     </w:p>
     <w:p>
       <w:r>
         <w:rPr>
-          <w:rFonts w:ascii="Tahoma" w:hAnsi="Tahoma" w:cs="Tahoma"/>
-          <w:szCs w:val="21"/>
+          <w:b/>
         </w:rPr>
-        <w:t>ใช้พิกัด 3 มิติ โดยแยกระนาบพื้น (แนวนอน) ออกจากความสูง (แนวตั้ง) อย่างชัดเจน เพื่อให้เงื่อนไขการตัดสินสอดคล้องกับหลักการของ TCAS จริงที่พิจารณา horizontal separation และ vertical separation แยกกัน</w:t>
+        <w:t xml:space="preserve">• Version: </w:t>
+      </w:r>
+      <w:r>
+        <w:t>รองรับการอัพเกรด Protocol ในอนาคต</w:t>
+      </w:r>
+    </w:p>
+    <w:p>
+      <w:r>
+        <w:rPr>
+          <w:b/>
+        </w:rPr>
+        <w:t xml:space="preserve">• Sequence Number: </w:t>
+      </w:r>
+      <w:r>
+        <w:t>ใช้ตรวจจับการสูญหายหรือสลับลำดับของ Packet</w:t>
+      </w:r>
+    </w:p>
+    <w:p>
+      <w:pPr>
+        <w:pStyle w:val="Heading2"/>
+      </w:pPr>
+      <w:r>
+        <w:t>3.2 รูปแบบ Response (Server → Client)</w:t>
+      </w:r>
+    </w:p>
+    <w:p>
+      <w:pPr>
+        <w:pStyle w:val="IntenseQuote"/>
+      </w:pPr>
+      <w:r>
+        <w:t>TCASP/&lt;version&gt; &lt;seq_no&gt; [&lt;flight_ID&gt;] &lt;Status_Code&gt; &lt;Status_Phrase&gt; &lt;Message&gt;</w:t>
       </w:r>
     </w:p>
     <w:tbl>
       <w:tblPr>
-        <w:tblStyle w:val="TableGrid"/>
+        <w:tblStyle w:val="LightShading-Accent1"/>
         <w:tblW w:type="auto" w:w="0"/>
         <w:jc w:val="center"/>
         <w:tblLook w:firstColumn="1" w:firstRow="1" w:lastColumn="0" w:lastRow="0" w:noHBand="0" w:noVBand="1" w:val="04A0"/>
@@ -186,73 +165,31 @@
       <w:tr>
         <w:tc>
           <w:tcPr>
-            <w:tcW w:type="dxa" w:w="1440"/>
-            <w:shd w:fill="1F3B57"/>
+            <w:tcW w:type="dxa" w:w="2880"/>
           </w:tcPr>
           <w:p>
             <w:r>
-              <w:rPr>
-                <w:rFonts w:ascii="Tahoma" w:hAnsi="Tahoma" w:cs="Tahoma"/>
-                <w:szCs w:val="21"/>
-              </w:rPr>
-            </w:r>
-            <w:r>
-              <w:rPr>
-                <w:rFonts w:ascii="Tahoma" w:hAnsi="Tahoma" w:cs="Tahoma"/>
-                <w:b/>
-                <w:color w:val="FFFFFF"/>
-                <w:sz w:val="20"/>
-                <w:szCs w:val="20"/>
-              </w:rPr>
-              <w:t>แกน</w:t>
+              <w:t>รหัสสถานะ</w:t>
             </w:r>
           </w:p>
         </w:tc>
         <w:tc>
           <w:tcPr>
-            <w:tcW w:type="dxa" w:w="4608"/>
-            <w:shd w:fill="1F3B57"/>
+            <w:tcW w:type="dxa" w:w="2880"/>
           </w:tcPr>
           <w:p>
             <w:r>
-              <w:rPr>
-                <w:rFonts w:ascii="Tahoma" w:hAnsi="Tahoma" w:cs="Tahoma"/>
-                <w:szCs w:val="21"/>
-              </w:rPr>
-            </w:r>
-            <w:r>
-              <w:rPr>
-                <w:rFonts w:ascii="Tahoma" w:hAnsi="Tahoma" w:cs="Tahoma"/>
-                <w:b/>
-                <w:color w:val="FFFFFF"/>
-                <w:sz w:val="20"/>
-                <w:szCs w:val="20"/>
-              </w:rPr>
-              <w:t>ความหมาย</w:t>
+              <w:t>ชื่อสถานะ</w:t>
             </w:r>
           </w:p>
         </w:tc>
         <w:tc>
           <w:tcPr>
-            <w:tcW w:type="dxa" w:w="2592"/>
-            <w:shd w:fill="1F3B57"/>
+            <w:tcW w:type="dxa" w:w="2880"/>
           </w:tcPr>
           <w:p>
             <w:r>
-              <w:rPr>
-                <w:rFonts w:ascii="Tahoma" w:hAnsi="Tahoma" w:cs="Tahoma"/>
-                <w:szCs w:val="21"/>
-              </w:rPr>
-            </w:r>
-            <w:r>
-              <w:rPr>
-                <w:rFonts w:ascii="Tahoma" w:hAnsi="Tahoma" w:cs="Tahoma"/>
-                <w:b/>
-                <w:color w:val="FFFFFF"/>
-                <w:sz w:val="20"/>
-                <w:szCs w:val="20"/>
-              </w:rPr>
-              <w:t>หน่วย</w:t>
+              <w:t>ความหมาย</w:t>
             </w:r>
           </w:p>
         </w:tc>
@@ -260,64 +197,31 @@
       <w:tr>
         <w:tc>
           <w:tcPr>
-            <w:tcW w:type="dxa" w:w="1440"/>
+            <w:tcW w:type="dxa" w:w="2880"/>
           </w:tcPr>
           <w:p>
             <w:r>
-              <w:rPr>
-                <w:rFonts w:ascii="Tahoma" w:hAnsi="Tahoma" w:cs="Tahoma"/>
-                <w:szCs w:val="21"/>
-              </w:rPr>
-            </w:r>
-            <w:r>
-              <w:rPr>
-                <w:rFonts w:ascii="Tahoma" w:hAnsi="Tahoma" w:cs="Tahoma"/>
-                <w:sz w:val="20"/>
-                <w:szCs w:val="20"/>
-              </w:rPr>
-              <w:t>posX</w:t>
+              <w:t>200</w:t>
             </w:r>
           </w:p>
         </w:tc>
         <w:tc>
           <w:tcPr>
-            <w:tcW w:type="dxa" w:w="4608"/>
+            <w:tcW w:type="dxa" w:w="2880"/>
           </w:tcPr>
           <w:p>
             <w:r>
-              <w:rPr>
-                <w:rFonts w:ascii="Tahoma" w:hAnsi="Tahoma" w:cs="Tahoma"/>
-                <w:szCs w:val="21"/>
-              </w:rPr>
-            </w:r>
-            <w:r>
-              <w:rPr>
-                <w:rFonts w:ascii="Tahoma" w:hAnsi="Tahoma" w:cs="Tahoma"/>
-                <w:sz w:val="20"/>
-                <w:szCs w:val="20"/>
-              </w:rPr>
-              <w:t>ระนาบพื้น แกนที่หนึ่ง</w:t>
+              <w:t>CLEAR</w:t>
             </w:r>
           </w:p>
         </w:tc>
         <w:tc>
           <w:tcPr>
-            <w:tcW w:type="dxa" w:w="2592"/>
+            <w:tcW w:type="dxa" w:w="2880"/>
           </w:tcPr>
           <w:p>
             <w:r>
-              <w:rPr>
-                <w:rFonts w:ascii="Tahoma" w:hAnsi="Tahoma" w:cs="Tahoma"/>
-                <w:szCs w:val="21"/>
-              </w:rPr>
-            </w:r>
-            <w:r>
-              <w:rPr>
-                <w:rFonts w:ascii="Tahoma" w:hAnsi="Tahoma" w:cs="Tahoma"/>
-                <w:sz w:val="20"/>
-                <w:szCs w:val="20"/>
-              </w:rPr>
-              <w:t>nautical mile (nm)</w:t>
+              <w:t>ปลอดภัย รักษาทิศทางบินเดิม</w:t>
             </w:r>
           </w:p>
         </w:tc>
@@ -325,64 +229,31 @@
       <w:tr>
         <w:tc>
           <w:tcPr>
-            <w:tcW w:type="dxa" w:w="1440"/>
+            <w:tcW w:type="dxa" w:w="2880"/>
           </w:tcPr>
           <w:p>
             <w:r>
-              <w:rPr>
-                <w:rFonts w:ascii="Tahoma" w:hAnsi="Tahoma" w:cs="Tahoma"/>
-                <w:szCs w:val="21"/>
-              </w:rPr>
-            </w:r>
-            <w:r>
-              <w:rPr>
-                <w:rFonts w:ascii="Tahoma" w:hAnsi="Tahoma" w:cs="Tahoma"/>
-                <w:sz w:val="20"/>
-                <w:szCs w:val="20"/>
-              </w:rPr>
-              <w:t>posY</w:t>
+              <w:t>300</w:t>
             </w:r>
           </w:p>
         </w:tc>
         <w:tc>
           <w:tcPr>
-            <w:tcW w:type="dxa" w:w="4608"/>
+            <w:tcW w:type="dxa" w:w="2880"/>
           </w:tcPr>
           <w:p>
             <w:r>
-              <w:rPr>
-                <w:rFonts w:ascii="Tahoma" w:hAnsi="Tahoma" w:cs="Tahoma"/>
-                <w:szCs w:val="21"/>
-              </w:rPr>
-            </w:r>
-            <w:r>
-              <w:rPr>
-                <w:rFonts w:ascii="Tahoma" w:hAnsi="Tahoma" w:cs="Tahoma"/>
-                <w:sz w:val="20"/>
-                <w:szCs w:val="20"/>
-              </w:rPr>
-              <w:t>ความสูงจากระดับน้ำทะเล</w:t>
+              <w:t>TA_TRAFFIC</w:t>
             </w:r>
           </w:p>
         </w:tc>
         <w:tc>
           <w:tcPr>
-            <w:tcW w:type="dxa" w:w="2592"/>
+            <w:tcW w:type="dxa" w:w="2880"/>
           </w:tcPr>
           <w:p>
             <w:r>
-              <w:rPr>
-                <w:rFonts w:ascii="Tahoma" w:hAnsi="Tahoma" w:cs="Tahoma"/>
-                <w:szCs w:val="21"/>
-              </w:rPr>
-            </w:r>
-            <w:r>
-              <w:rPr>
-                <w:rFonts w:ascii="Tahoma" w:hAnsi="Tahoma" w:cs="Tahoma"/>
-                <w:sz w:val="20"/>
-                <w:szCs w:val="20"/>
-              </w:rPr>
-              <w:t>foot (ft)</w:t>
+              <w:t>แจ้งเตือนจราจรทางอากาศ ให้เฝ้าระวัง</w:t>
             </w:r>
           </w:p>
         </w:tc>
@@ -390,168 +261,308 @@
       <w:tr>
         <w:tc>
           <w:tcPr>
-            <w:tcW w:type="dxa" w:w="1440"/>
+            <w:tcW w:type="dxa" w:w="2880"/>
           </w:tcPr>
           <w:p>
             <w:r>
-              <w:rPr>
-                <w:rFonts w:ascii="Tahoma" w:hAnsi="Tahoma" w:cs="Tahoma"/>
-                <w:szCs w:val="21"/>
-              </w:rPr>
-            </w:r>
-            <w:r>
-              <w:rPr>
-                <w:rFonts w:ascii="Tahoma" w:hAnsi="Tahoma" w:cs="Tahoma"/>
-                <w:sz w:val="20"/>
-                <w:szCs w:val="20"/>
-              </w:rPr>
-              <w:t>posZ</w:t>
+              <w:t>400</w:t>
             </w:r>
           </w:p>
         </w:tc>
         <w:tc>
           <w:tcPr>
-            <w:tcW w:type="dxa" w:w="4608"/>
+            <w:tcW w:type="dxa" w:w="2880"/>
           </w:tcPr>
           <w:p>
             <w:r>
-              <w:rPr>
-                <w:rFonts w:ascii="Tahoma" w:hAnsi="Tahoma" w:cs="Tahoma"/>
-                <w:szCs w:val="21"/>
-              </w:rPr>
-            </w:r>
-            <w:r>
-              <w:rPr>
-                <w:rFonts w:ascii="Tahoma" w:hAnsi="Tahoma" w:cs="Tahoma"/>
-                <w:sz w:val="20"/>
-                <w:szCs w:val="20"/>
-              </w:rPr>
-              <w:t>ระนาบพื้น แกนที่สอง</w:t>
+              <w:t>BAD_REQUEST</w:t>
             </w:r>
           </w:p>
         </w:tc>
         <w:tc>
           <w:tcPr>
-            <w:tcW w:type="dxa" w:w="2592"/>
+            <w:tcW w:type="dxa" w:w="2880"/>
           </w:tcPr>
           <w:p>
             <w:r>
-              <w:rPr>
-                <w:rFonts w:ascii="Tahoma" w:hAnsi="Tahoma" w:cs="Tahoma"/>
-                <w:szCs w:val="21"/>
-              </w:rPr>
+              <w:t>ข้อมูลที่ส่งมาไม่ถูกต้อง</w:t>
             </w:r>
+          </w:p>
+        </w:tc>
+      </w:tr>
+      <w:tr>
+        <w:tc>
+          <w:tcPr>
+            <w:tcW w:type="dxa" w:w="2880"/>
+          </w:tcPr>
+          <w:p>
             <w:r>
-              <w:rPr>
-                <w:rFonts w:ascii="Tahoma" w:hAnsi="Tahoma" w:cs="Tahoma"/>
-                <w:sz w:val="20"/>
-                <w:szCs w:val="20"/>
-              </w:rPr>
-              <w:t>nautical mile (nm)</w:t>
+              <w:t>401</w:t>
+            </w:r>
+          </w:p>
+        </w:tc>
+        <w:tc>
+          <w:tcPr>
+            <w:tcW w:type="dxa" w:w="2880"/>
+          </w:tcPr>
+          <w:p>
+            <w:r>
+              <w:t>RA_CLIMB</w:t>
+            </w:r>
+          </w:p>
+        </w:tc>
+        <w:tc>
+          <w:tcPr>
+            <w:tcW w:type="dxa" w:w="2880"/>
+          </w:tcPr>
+          <w:p>
+            <w:r>
+              <w:t>คำสั่งเร่งด่วน: ไต่ระดับขึ้นทันที</w:t>
+            </w:r>
+          </w:p>
+        </w:tc>
+      </w:tr>
+      <w:tr>
+        <w:tc>
+          <w:tcPr>
+            <w:tcW w:type="dxa" w:w="2880"/>
+          </w:tcPr>
+          <w:p>
+            <w:r>
+              <w:t>402</w:t>
+            </w:r>
+          </w:p>
+        </w:tc>
+        <w:tc>
+          <w:tcPr>
+            <w:tcW w:type="dxa" w:w="2880"/>
+          </w:tcPr>
+          <w:p>
+            <w:r>
+              <w:t>RA_DESCEND</w:t>
+            </w:r>
+          </w:p>
+        </w:tc>
+        <w:tc>
+          <w:tcPr>
+            <w:tcW w:type="dxa" w:w="2880"/>
+          </w:tcPr>
+          <w:p>
+            <w:r>
+              <w:t>คำสั่งเร่งด่วน: ลดระดับลงทันที</w:t>
+            </w:r>
+          </w:p>
+        </w:tc>
+      </w:tr>
+      <w:tr>
+        <w:tc>
+          <w:tcPr>
+            <w:tcW w:type="dxa" w:w="2880"/>
+          </w:tcPr>
+          <w:p>
+            <w:r>
+              <w:t>500</w:t>
+            </w:r>
+          </w:p>
+        </w:tc>
+        <w:tc>
+          <w:tcPr>
+            <w:tcW w:type="dxa" w:w="2880"/>
+          </w:tcPr>
+          <w:p>
+            <w:r>
+              <w:t>DISCONNECT</w:t>
+            </w:r>
+          </w:p>
+        </w:tc>
+        <w:tc>
+          <w:tcPr>
+            <w:tcW w:type="dxa" w:w="2880"/>
+          </w:tcPr>
+          <w:p>
+            <w:r>
+              <w:t>เครื่องบินชนกัน ถูกลบออกจากเรดาร์</w:t>
             </w:r>
           </w:p>
         </w:tc>
       </w:tr>
     </w:tbl>
-    <w:p>
-      <w:pPr>
-        <w:spacing w:after="80"/>
-      </w:pPr>
-    </w:p>
+    <w:p/>
     <w:p>
       <w:pPr>
         <w:pStyle w:val="Heading1"/>
       </w:pPr>
       <w:r>
-        <w:rPr>
-          <w:rFonts w:ascii="Tahoma" w:hAnsi="Tahoma" w:cs="Tahoma"/>
-          <w:szCs w:val="30"/>
-        </w:rPr>
-        <w:t>3. รูปแบบข้อความ</w:t>
+        <w:t>4. ระบบพิกัดและกฎระยะปลอดภัย</w:t>
       </w:r>
     </w:p>
     <w:p>
-      <w:pPr>
-        <w:pStyle w:val="Heading2"/>
-      </w:pPr>
       <w:r>
-        <w:rPr>
-          <w:rFonts w:ascii="Tahoma" w:hAnsi="Tahoma" w:cs="Tahoma"/>
-          <w:szCs w:val="25"/>
-        </w:rPr>
-        <w:t>3.1 Request (Client → Server)</w:t>
+        <w:t>ระบบใช้ระบบพิกัด 3 มิติ:</w:t>
+        <w:br/>
+        <w:t>• posX: แกนแนวนอน (หน่วย: ไมล์ทะเล)</w:t>
+        <w:br/>
+        <w:t>• posY: ระดับความสูง (หน่วย: ฟุต)</w:t>
+        <w:br/>
+        <w:t>• posZ: แกนแนวนอน (หน่วย: ไมล์ทะเล)</w:t>
       </w:r>
-    </w:p>
-    <w:p>
-      <w:pPr>
-        <w:pStyle w:val="CodeBlock"/>
-        <w:spacing w:after="0" w:before="0"/>
-      </w:pPr>
-      <w:r>
-        <w:rPr>
-          <w:rFonts w:ascii="Consolas" w:hAnsi="Consolas" w:cs="Tahoma"/>
-          <w:szCs w:val="18"/>
-        </w:rPr>
-        <w:t>PING &lt;flight_ID&gt; &lt;posX_nm&gt; &lt;posY_ft&gt; &lt;posZ_nm&gt;</w:t>
-      </w:r>
-    </w:p>
-    <w:p>
-      <w:pPr>
-        <w:pStyle w:val="CodeBlock"/>
-        <w:spacing w:after="0" w:before="0"/>
-      </w:pPr>
-    </w:p>
-    <w:p>
-      <w:pPr>
-        <w:pStyle w:val="CodeBlock"/>
-        <w:spacing w:after="0" w:before="0"/>
-      </w:pPr>
-      <w:r>
-        <w:rPr>
-          <w:rFonts w:ascii="Consolas" w:hAnsi="Consolas" w:cs="Tahoma"/>
-          <w:szCs w:val="18"/>
-        </w:rPr>
-        <w:t>ตัวอย่าง:  PING TG611 -4.0 32000.0 0.0</w:t>
-      </w:r>
-    </w:p>
-    <w:p>
-      <w:pPr>
-        <w:spacing w:after="80"/>
-      </w:pPr>
-    </w:p>
-    <w:p>
-      <w:pPr>
-        <w:pStyle w:val="Heading2"/>
-      </w:pPr>
-      <w:r>
-        <w:rPr>
-          <w:rFonts w:ascii="Tahoma" w:hAnsi="Tahoma" w:cs="Tahoma"/>
-          <w:szCs w:val="25"/>
-        </w:rPr>
-        <w:t>3.2 Response (Server → Client)</w:t>
-      </w:r>
-    </w:p>
-    <w:p>
-      <w:pPr>
-        <w:pStyle w:val="CodeBlock"/>
-        <w:spacing w:after="0" w:before="0"/>
-      </w:pPr>
-      <w:r>
-        <w:rPr>
-          <w:rFonts w:ascii="Consolas" w:hAnsi="Consolas" w:cs="Tahoma"/>
-          <w:szCs w:val="18"/>
-        </w:rPr>
-        <w:t>[&lt;flight_ID&gt;] &lt;Status_Code&gt; &lt;Status_Phrase&gt; &lt;Message&gt;</w:t>
-      </w:r>
-    </w:p>
-    <w:p>
-      <w:pPr>
-        <w:spacing w:after="80"/>
-      </w:pPr>
     </w:p>
     <w:tbl>
       <w:tblPr>
-        <w:tblStyle w:val="TableGrid"/>
+        <w:tblStyle w:val="LightShading-Accent1"/>
+        <w:tblW w:type="auto" w:w="0"/>
+        <w:jc w:val="center"/>
+        <w:tblLook w:firstColumn="1" w:firstRow="1" w:lastColumn="0" w:lastRow="0" w:noHBand="0" w:noVBand="1" w:val="04A0"/>
+      </w:tblPr>
+      <w:tblGrid>
+        <w:gridCol w:w="4320"/>
+        <w:gridCol w:w="4320"/>
+      </w:tblGrid>
+      <w:tr>
+        <w:tc>
+          <w:tcPr>
+            <w:tcW w:type="dxa" w:w="4320"/>
+          </w:tcPr>
+          <w:p>
+            <w:r>
+              <w:t>เงื่อนไข</w:t>
+            </w:r>
+          </w:p>
+        </w:tc>
+        <w:tc>
+          <w:tcPr>
+            <w:tcW w:type="dxa" w:w="4320"/>
+          </w:tcPr>
+          <w:p>
+            <w:r>
+              <w:t>สถานะ</w:t>
+            </w:r>
+          </w:p>
+        </w:tc>
+      </w:tr>
+      <w:tr>
+        <w:tc>
+          <w:tcPr>
+            <w:tcW w:type="dxa" w:w="4320"/>
+          </w:tcPr>
+          <w:p>
+            <w:r>
+              <w:t>ระดับความสูงห่างกัน ≥ 1000 ฟุต</w:t>
+            </w:r>
+          </w:p>
+        </w:tc>
+        <w:tc>
+          <w:tcPr>
+            <w:tcW w:type="dxa" w:w="4320"/>
+          </w:tcPr>
+          <w:p>
+            <w:r>
+              <w:t>200 CLEAR (ปลอดภัย ไม่ว่าแนวนอนจะใกล้แค่ไหน)</w:t>
+            </w:r>
+          </w:p>
+        </w:tc>
+      </w:tr>
+      <w:tr>
+        <w:tc>
+          <w:tcPr>
+            <w:tcW w:type="dxa" w:w="4320"/>
+          </w:tcPr>
+          <w:p>
+            <w:r>
+              <w:t>ระยะแนวนอน &gt; 5.0 ไมล์ทะเล</w:t>
+            </w:r>
+          </w:p>
+        </w:tc>
+        <w:tc>
+          <w:tcPr>
+            <w:tcW w:type="dxa" w:w="4320"/>
+          </w:tcPr>
+          <w:p>
+            <w:r>
+              <w:t>200 CLEAR</w:t>
+            </w:r>
+          </w:p>
+        </w:tc>
+      </w:tr>
+      <w:tr>
+        <w:tc>
+          <w:tcPr>
+            <w:tcW w:type="dxa" w:w="4320"/>
+          </w:tcPr>
+          <w:p>
+            <w:r>
+              <w:t>ระยะแนวนอน &gt; 2.0 ไมล์ทะเล</w:t>
+            </w:r>
+          </w:p>
+        </w:tc>
+        <w:tc>
+          <w:tcPr>
+            <w:tcW w:type="dxa" w:w="4320"/>
+          </w:tcPr>
+          <w:p>
+            <w:r>
+              <w:t>300 TA_TRAFFIC</w:t>
+            </w:r>
+          </w:p>
+        </w:tc>
+      </w:tr>
+      <w:tr>
+        <w:tc>
+          <w:tcPr>
+            <w:tcW w:type="dxa" w:w="4320"/>
+          </w:tcPr>
+          <w:p>
+            <w:r>
+              <w:t>ระยะแนวนอน &gt; 0.0 ไมล์ทะเล</w:t>
+            </w:r>
+          </w:p>
+        </w:tc>
+        <w:tc>
+          <w:tcPr>
+            <w:tcW w:type="dxa" w:w="4320"/>
+          </w:tcPr>
+          <w:p>
+            <w:r>
+              <w:t>401 RA_CLIMB / 402 RA_DESCEND</w:t>
+            </w:r>
+          </w:p>
+        </w:tc>
+      </w:tr>
+      <w:tr>
+        <w:tc>
+          <w:tcPr>
+            <w:tcW w:type="dxa" w:w="4320"/>
+          </w:tcPr>
+          <w:p>
+            <w:r>
+              <w:t>ระยะแนวนอน = 0.0 และ ความสูงห่างกัน &lt; 1000 ฟุต</w:t>
+            </w:r>
+          </w:p>
+        </w:tc>
+        <w:tc>
+          <w:tcPr>
+            <w:tcW w:type="dxa" w:w="4320"/>
+          </w:tcPr>
+          <w:p>
+            <w:r>
+              <w:t>500 DISCONNECT (ชนกัน)</w:t>
+            </w:r>
+          </w:p>
+        </w:tc>
+      </w:tr>
+    </w:tbl>
+    <w:p/>
+    <w:p>
+      <w:pPr>
+        <w:pStyle w:val="Heading1"/>
+      </w:pPr>
+      <w:r>
+        <w:t>5. เปรียบเทียบสถาปัตยกรรม: Client-Server vs P2P</w:t>
+      </w:r>
+    </w:p>
+    <w:tbl>
+      <w:tblPr>
+        <w:tblStyle w:val="LightShading-Accent1"/>
         <w:tblW w:type="auto" w:w="0"/>
         <w:jc w:val="center"/>
         <w:tblLook w:firstColumn="1" w:firstRow="1" w:lastColumn="0" w:lastRow="0" w:noHBand="0" w:noVBand="1" w:val="04A0"/>
@@ -564,73 +575,31 @@
       <w:tr>
         <w:tc>
           <w:tcPr>
-            <w:tcW w:type="dxa" w:w="1152"/>
-            <w:shd w:fill="1F3B57"/>
+            <w:tcW w:type="dxa" w:w="2880"/>
           </w:tcPr>
           <w:p>
             <w:r>
-              <w:rPr>
-                <w:rFonts w:ascii="Tahoma" w:hAnsi="Tahoma" w:cs="Tahoma"/>
-                <w:szCs w:val="21"/>
-              </w:rPr>
-            </w:r>
-            <w:r>
-              <w:rPr>
-                <w:rFonts w:ascii="Tahoma" w:hAnsi="Tahoma" w:cs="Tahoma"/>
-                <w:b/>
-                <w:color w:val="FFFFFF"/>
-                <w:sz w:val="20"/>
-                <w:szCs w:val="20"/>
-              </w:rPr>
-              <w:t>Code</w:t>
+              <w:t>ด้าน</w:t>
             </w:r>
           </w:p>
         </w:tc>
         <w:tc>
           <w:tcPr>
-            <w:tcW w:type="dxa" w:w="2160"/>
-            <w:shd w:fill="1F3B57"/>
+            <w:tcW w:type="dxa" w:w="2880"/>
           </w:tcPr>
           <w:p>
             <w:r>
-              <w:rPr>
-                <w:rFonts w:ascii="Tahoma" w:hAnsi="Tahoma" w:cs="Tahoma"/>
-                <w:szCs w:val="21"/>
-              </w:rPr>
-            </w:r>
-            <w:r>
-              <w:rPr>
-                <w:rFonts w:ascii="Tahoma" w:hAnsi="Tahoma" w:cs="Tahoma"/>
-                <w:b/>
-                <w:color w:val="FFFFFF"/>
-                <w:sz w:val="20"/>
-                <w:szCs w:val="20"/>
-              </w:rPr>
-              <w:t>Phrase</w:t>
+              <w:t>P2P (TCAS ของจริง)</w:t>
             </w:r>
           </w:p>
         </w:tc>
         <w:tc>
           <w:tcPr>
-            <w:tcW w:type="dxa" w:w="5328"/>
-            <w:shd w:fill="1F3B57"/>
+            <w:tcW w:type="dxa" w:w="2880"/>
           </w:tcPr>
           <w:p>
             <w:r>
-              <w:rPr>
-                <w:rFonts w:ascii="Tahoma" w:hAnsi="Tahoma" w:cs="Tahoma"/>
-                <w:szCs w:val="21"/>
-              </w:rPr>
-            </w:r>
-            <w:r>
-              <w:rPr>
-                <w:rFonts w:ascii="Tahoma" w:hAnsi="Tahoma" w:cs="Tahoma"/>
-                <w:b/>
-                <w:color w:val="FFFFFF"/>
-                <w:sz w:val="20"/>
-                <w:szCs w:val="20"/>
-              </w:rPr>
-              <w:t>ความหมาย</w:t>
+              <w:t>Client-Server (TCASP ของเรา)</w:t>
             </w:r>
           </w:p>
         </w:tc>
@@ -638,64 +607,31 @@
       <w:tr>
         <w:tc>
           <w:tcPr>
-            <w:tcW w:type="dxa" w:w="1152"/>
+            <w:tcW w:type="dxa" w:w="2880"/>
           </w:tcPr>
           <w:p>
             <w:r>
-              <w:rPr>
-                <w:rFonts w:ascii="Tahoma" w:hAnsi="Tahoma" w:cs="Tahoma"/>
-                <w:szCs w:val="21"/>
-              </w:rPr>
-            </w:r>
-            <w:r>
-              <w:rPr>
-                <w:rFonts w:ascii="Tahoma" w:hAnsi="Tahoma" w:cs="Tahoma"/>
-                <w:sz w:val="20"/>
-                <w:szCs w:val="20"/>
-              </w:rPr>
-              <w:t>200</w:t>
+              <w:t>การประมวลผล</w:t>
             </w:r>
           </w:p>
         </w:tc>
         <w:tc>
           <w:tcPr>
-            <w:tcW w:type="dxa" w:w="2160"/>
+            <w:tcW w:type="dxa" w:w="2880"/>
           </w:tcPr>
           <w:p>
             <w:r>
-              <w:rPr>
-                <w:rFonts w:ascii="Tahoma" w:hAnsi="Tahoma" w:cs="Tahoma"/>
-                <w:szCs w:val="21"/>
-              </w:rPr>
-            </w:r>
-            <w:r>
-              <w:rPr>
-                <w:rFonts w:ascii="Tahoma" w:hAnsi="Tahoma" w:cs="Tahoma"/>
-                <w:sz w:val="20"/>
-                <w:szCs w:val="20"/>
-              </w:rPr>
-              <w:t>CLEAR</w:t>
+              <w:t>แต่ละลำคำนวณเอง</w:t>
             </w:r>
           </w:p>
         </w:tc>
         <w:tc>
           <w:tcPr>
-            <w:tcW w:type="dxa" w:w="5328"/>
+            <w:tcW w:type="dxa" w:w="2880"/>
           </w:tcPr>
           <w:p>
             <w:r>
-              <w:rPr>
-                <w:rFonts w:ascii="Tahoma" w:hAnsi="Tahoma" w:cs="Tahoma"/>
-                <w:szCs w:val="21"/>
-              </w:rPr>
-            </w:r>
-            <w:r>
-              <w:rPr>
-                <w:rFonts w:ascii="Tahoma" w:hAnsi="Tahoma" w:cs="Tahoma"/>
-                <w:sz w:val="20"/>
-                <w:szCs w:val="20"/>
-              </w:rPr>
-              <w:t>ปลอดภัย บินตามเส้นทางเดิมได้</w:t>
+              <w:t>Server กลางคำนวณให้ (Client เบา)</w:t>
             </w:r>
           </w:p>
         </w:tc>
@@ -703,64 +639,31 @@
       <w:tr>
         <w:tc>
           <w:tcPr>
-            <w:tcW w:type="dxa" w:w="1152"/>
+            <w:tcW w:type="dxa" w:w="2880"/>
           </w:tcPr>
           <w:p>
             <w:r>
-              <w:rPr>
-                <w:rFonts w:ascii="Tahoma" w:hAnsi="Tahoma" w:cs="Tahoma"/>
-                <w:szCs w:val="21"/>
-              </w:rPr>
-            </w:r>
-            <w:r>
-              <w:rPr>
-                <w:rFonts w:ascii="Tahoma" w:hAnsi="Tahoma" w:cs="Tahoma"/>
-                <w:sz w:val="20"/>
-                <w:szCs w:val="20"/>
-              </w:rPr>
-              <w:t>300</w:t>
+              <w:t>จุดเสี่ยง</w:t>
             </w:r>
           </w:p>
         </w:tc>
         <w:tc>
           <w:tcPr>
-            <w:tcW w:type="dxa" w:w="2160"/>
+            <w:tcW w:type="dxa" w:w="2880"/>
           </w:tcPr>
           <w:p>
             <w:r>
-              <w:rPr>
-                <w:rFonts w:ascii="Tahoma" w:hAnsi="Tahoma" w:cs="Tahoma"/>
-                <w:szCs w:val="21"/>
-              </w:rPr>
-            </w:r>
-            <w:r>
-              <w:rPr>
-                <w:rFonts w:ascii="Tahoma" w:hAnsi="Tahoma" w:cs="Tahoma"/>
-                <w:sz w:val="20"/>
-                <w:szCs w:val="20"/>
-              </w:rPr>
-              <w:t>TA_TRAFFIC</w:t>
+              <w:t>ไม่มี Single Point of Failure</w:t>
             </w:r>
           </w:p>
         </w:tc>
         <w:tc>
           <w:tcPr>
-            <w:tcW w:type="dxa" w:w="5328"/>
+            <w:tcW w:type="dxa" w:w="2880"/>
           </w:tcPr>
           <w:p>
             <w:r>
-              <w:rPr>
-                <w:rFonts w:ascii="Tahoma" w:hAnsi="Tahoma" w:cs="Tahoma"/>
-                <w:szCs w:val="21"/>
-              </w:rPr>
-            </w:r>
-            <w:r>
-              <w:rPr>
-                <w:rFonts w:ascii="Tahoma" w:hAnsi="Tahoma" w:cs="Tahoma"/>
-                <w:sz w:val="20"/>
-                <w:szCs w:val="20"/>
-              </w:rPr>
-              <w:t>Traffic Advisory — มีเครื่องบินใกล้ ให้เฝ้าระวัง</w:t>
+              <w:t>ถ้า Server ล่ม เครื่องบินทุกลำตาบอด</w:t>
             </w:r>
           </w:p>
         </w:tc>
@@ -768,623 +671,40 @@
       <w:tr>
         <w:tc>
           <w:tcPr>
-            <w:tcW w:type="dxa" w:w="1152"/>
+            <w:tcW w:type="dxa" w:w="2880"/>
           </w:tcPr>
           <w:p>
             <w:r>
-              <w:rPr>
-                <w:rFonts w:ascii="Tahoma" w:hAnsi="Tahoma" w:cs="Tahoma"/>
-                <w:szCs w:val="21"/>
-              </w:rPr>
-            </w:r>
-            <w:r>
-              <w:rPr>
-                <w:rFonts w:ascii="Tahoma" w:hAnsi="Tahoma" w:cs="Tahoma"/>
-                <w:sz w:val="20"/>
-                <w:szCs w:val="20"/>
-              </w:rPr>
-              <w:t>400</w:t>
+              <w:t>ความสามารถรองรับ</w:t>
             </w:r>
           </w:p>
         </w:tc>
         <w:tc>
           <w:tcPr>
-            <w:tcW w:type="dxa" w:w="2160"/>
+            <w:tcW w:type="dxa" w:w="2880"/>
           </w:tcPr>
           <w:p>
             <w:r>
-              <w:rPr>
-                <w:rFonts w:ascii="Tahoma" w:hAnsi="Tahoma" w:cs="Tahoma"/>
-                <w:szCs w:val="21"/>
-              </w:rPr>
-            </w:r>
-            <w:r>
-              <w:rPr>
-                <w:rFonts w:ascii="Tahoma" w:hAnsi="Tahoma" w:cs="Tahoma"/>
-                <w:sz w:val="20"/>
-                <w:szCs w:val="20"/>
-              </w:rPr>
-              <w:t>BAD_REQUEST</w:t>
+              <w:t>สัญญาณวุ่นวายเมื่อมีเครื่องบินเยอะ</w:t>
             </w:r>
           </w:p>
         </w:tc>
         <w:tc>
           <w:tcPr>
-            <w:tcW w:type="dxa" w:w="5328"/>
+            <w:tcW w:type="dxa" w:w="2880"/>
           </w:tcPr>
           <w:p>
             <w:r>
-              <w:rPr>
-                <w:rFonts w:ascii="Tahoma" w:hAnsi="Tahoma" w:cs="Tahoma"/>
-                <w:szCs w:val="21"/>
-              </w:rPr>
-            </w:r>
-            <w:r>
-              <w:rPr>
-                <w:rFonts w:ascii="Tahoma" w:hAnsi="Tahoma" w:cs="Tahoma"/>
-                <w:sz w:val="20"/>
-                <w:szCs w:val="20"/>
-              </w:rPr>
-              <w:t>รูปแบบข้อความไม่ถูกต้อง</w:t>
-            </w:r>
-          </w:p>
-        </w:tc>
-      </w:tr>
-      <w:tr>
-        <w:tc>
-          <w:tcPr>
-            <w:tcW w:type="dxa" w:w="1152"/>
-          </w:tcPr>
-          <w:p>
-            <w:r>
-              <w:rPr>
-                <w:rFonts w:ascii="Tahoma" w:hAnsi="Tahoma" w:cs="Tahoma"/>
-                <w:szCs w:val="21"/>
-              </w:rPr>
-            </w:r>
-            <w:r>
-              <w:rPr>
-                <w:rFonts w:ascii="Tahoma" w:hAnsi="Tahoma" w:cs="Tahoma"/>
-                <w:sz w:val="20"/>
-                <w:szCs w:val="20"/>
-              </w:rPr>
-              <w:t>401</w:t>
-            </w:r>
-          </w:p>
-        </w:tc>
-        <w:tc>
-          <w:tcPr>
-            <w:tcW w:type="dxa" w:w="2160"/>
-          </w:tcPr>
-          <w:p>
-            <w:r>
-              <w:rPr>
-                <w:rFonts w:ascii="Tahoma" w:hAnsi="Tahoma" w:cs="Tahoma"/>
-                <w:szCs w:val="21"/>
-              </w:rPr>
-            </w:r>
-            <w:r>
-              <w:rPr>
-                <w:rFonts w:ascii="Tahoma" w:hAnsi="Tahoma" w:cs="Tahoma"/>
-                <w:sz w:val="20"/>
-                <w:szCs w:val="20"/>
-              </w:rPr>
-              <w:t>RA_CLIMB</w:t>
-            </w:r>
-          </w:p>
-        </w:tc>
-        <w:tc>
-          <w:tcPr>
-            <w:tcW w:type="dxa" w:w="5328"/>
-          </w:tcPr>
-          <w:p>
-            <w:r>
-              <w:rPr>
-                <w:rFonts w:ascii="Tahoma" w:hAnsi="Tahoma" w:cs="Tahoma"/>
-                <w:szCs w:val="21"/>
-              </w:rPr>
-            </w:r>
-            <w:r>
-              <w:rPr>
-                <w:rFonts w:ascii="Tahoma" w:hAnsi="Tahoma" w:cs="Tahoma"/>
-                <w:sz w:val="20"/>
-                <w:szCs w:val="20"/>
-              </w:rPr>
-              <w:t>Resolution Advisory — สั่งไต่ระดับขึ้นทันที</w:t>
-            </w:r>
-          </w:p>
-        </w:tc>
-      </w:tr>
-      <w:tr>
-        <w:tc>
-          <w:tcPr>
-            <w:tcW w:type="dxa" w:w="1152"/>
-          </w:tcPr>
-          <w:p>
-            <w:r>
-              <w:rPr>
-                <w:rFonts w:ascii="Tahoma" w:hAnsi="Tahoma" w:cs="Tahoma"/>
-                <w:szCs w:val="21"/>
-              </w:rPr>
-            </w:r>
-            <w:r>
-              <w:rPr>
-                <w:rFonts w:ascii="Tahoma" w:hAnsi="Tahoma" w:cs="Tahoma"/>
-                <w:sz w:val="20"/>
-                <w:szCs w:val="20"/>
-              </w:rPr>
-              <w:t>402</w:t>
-            </w:r>
-          </w:p>
-        </w:tc>
-        <w:tc>
-          <w:tcPr>
-            <w:tcW w:type="dxa" w:w="2160"/>
-          </w:tcPr>
-          <w:p>
-            <w:r>
-              <w:rPr>
-                <w:rFonts w:ascii="Tahoma" w:hAnsi="Tahoma" w:cs="Tahoma"/>
-                <w:szCs w:val="21"/>
-              </w:rPr>
-            </w:r>
-            <w:r>
-              <w:rPr>
-                <w:rFonts w:ascii="Tahoma" w:hAnsi="Tahoma" w:cs="Tahoma"/>
-                <w:sz w:val="20"/>
-                <w:szCs w:val="20"/>
-              </w:rPr>
-              <w:t>RA_DESCEND</w:t>
-            </w:r>
-          </w:p>
-        </w:tc>
-        <w:tc>
-          <w:tcPr>
-            <w:tcW w:type="dxa" w:w="5328"/>
-          </w:tcPr>
-          <w:p>
-            <w:r>
-              <w:rPr>
-                <w:rFonts w:ascii="Tahoma" w:hAnsi="Tahoma" w:cs="Tahoma"/>
-                <w:szCs w:val="21"/>
-              </w:rPr>
-            </w:r>
-            <w:r>
-              <w:rPr>
-                <w:rFonts w:ascii="Tahoma" w:hAnsi="Tahoma" w:cs="Tahoma"/>
-                <w:sz w:val="20"/>
-                <w:szCs w:val="20"/>
-              </w:rPr>
-              <w:t>Resolution Advisory — สั่งลดระดับลงทันที</w:t>
-            </w:r>
-          </w:p>
-        </w:tc>
-      </w:tr>
-      <w:tr>
-        <w:tc>
-          <w:tcPr>
-            <w:tcW w:type="dxa" w:w="1152"/>
-          </w:tcPr>
-          <w:p>
-            <w:r>
-              <w:rPr>
-                <w:rFonts w:ascii="Tahoma" w:hAnsi="Tahoma" w:cs="Tahoma"/>
-                <w:szCs w:val="21"/>
-              </w:rPr>
-            </w:r>
-            <w:r>
-              <w:rPr>
-                <w:rFonts w:ascii="Tahoma" w:hAnsi="Tahoma" w:cs="Tahoma"/>
-                <w:sz w:val="20"/>
-                <w:szCs w:val="20"/>
-              </w:rPr>
-              <w:t>500</w:t>
-            </w:r>
-          </w:p>
-        </w:tc>
-        <w:tc>
-          <w:tcPr>
-            <w:tcW w:type="dxa" w:w="2160"/>
-          </w:tcPr>
-          <w:p>
-            <w:r>
-              <w:rPr>
-                <w:rFonts w:ascii="Tahoma" w:hAnsi="Tahoma" w:cs="Tahoma"/>
-                <w:szCs w:val="21"/>
-              </w:rPr>
-            </w:r>
-            <w:r>
-              <w:rPr>
-                <w:rFonts w:ascii="Tahoma" w:hAnsi="Tahoma" w:cs="Tahoma"/>
-                <w:sz w:val="20"/>
-                <w:szCs w:val="20"/>
-              </w:rPr>
-              <w:t>DISCONNECT</w:t>
-            </w:r>
-          </w:p>
-        </w:tc>
-        <w:tc>
-          <w:tcPr>
-            <w:tcW w:type="dxa" w:w="5328"/>
-          </w:tcPr>
-          <w:p>
-            <w:r>
-              <w:rPr>
-                <w:rFonts w:ascii="Tahoma" w:hAnsi="Tahoma" w:cs="Tahoma"/>
-                <w:szCs w:val="21"/>
-              </w:rPr>
-            </w:r>
-            <w:r>
-              <w:rPr>
-                <w:rFonts w:ascii="Tahoma" w:hAnsi="Tahoma" w:cs="Tahoma"/>
-                <w:sz w:val="20"/>
-                <w:szCs w:val="20"/>
-              </w:rPr>
-              <w:t>เกิดการชน ตัดการเชื่อมต่อ</w:t>
+              <w:t>Server จัดการได้ทุกลำด้วย Global View</w:t>
             </w:r>
           </w:p>
         </w:tc>
       </w:tr>
     </w:tbl>
-    <w:p>
-      <w:pPr>
-        <w:spacing w:after="80"/>
-      </w:pPr>
-    </w:p>
-    <w:p>
-      <w:pPr>
-        <w:pStyle w:val="Heading1"/>
-      </w:pPr>
-      <w:r>
-        <w:rPr>
-          <w:rFonts w:ascii="Tahoma" w:hAnsi="Tahoma" w:cs="Tahoma"/>
-          <w:szCs w:val="30"/>
-        </w:rPr>
-        <w:t>4. เกณฑ์การตัดสิน</w:t>
-      </w:r>
-    </w:p>
+    <w:p/>
     <w:p>
       <w:r>
-        <w:rPr>
-          <w:rFonts w:ascii="Tahoma" w:hAnsi="Tahoma" w:cs="Tahoma"/>
-          <w:szCs w:val="21"/>
-        </w:rPr>
-        <w:t>server คำนวณค่าสองตัวจากตำแหน่งของเครื่องบินคู่ที่พิจารณา แล้วนำมาตัดสินร่วมกัน โดยเครื่องบินจะถือว่าอยู่ในภาวะเสี่ยงเมื่อใกล้กันทั้งแนวนอนและแนวตั้ง</w:t>
-      </w:r>
-    </w:p>
-    <w:p>
-      <w:pPr>
-        <w:pStyle w:val="CodeBlock"/>
-        <w:spacing w:after="0" w:before="0"/>
-      </w:pPr>
-      <w:r>
-        <w:rPr>
-          <w:rFonts w:ascii="Consolas" w:hAnsi="Consolas" w:cs="Tahoma"/>
-          <w:szCs w:val="18"/>
-        </w:rPr>
-        <w:t>total_distance = sqrt( (posX1 - posX2)^2 + (posZ1 - posZ2)^2 )     # แนวนอน (nm)</w:t>
-      </w:r>
-    </w:p>
-    <w:p>
-      <w:pPr>
-        <w:pStyle w:val="CodeBlock"/>
-        <w:spacing w:after="0" w:before="0"/>
-      </w:pPr>
-      <w:r>
-        <w:rPr>
-          <w:rFonts w:ascii="Consolas" w:hAnsi="Consolas" w:cs="Tahoma"/>
-          <w:szCs w:val="18"/>
-        </w:rPr>
-        <w:t>vertical_gap   = abs( posY1 - posY2 )                             # แนวตั้ง (ft)</w:t>
-      </w:r>
-    </w:p>
-    <w:p>
-      <w:pPr>
-        <w:spacing w:after="80"/>
-      </w:pPr>
-    </w:p>
-    <w:tbl>
-      <w:tblPr>
-        <w:tblStyle w:val="TableGrid"/>
-        <w:tblW w:type="auto" w:w="0"/>
-        <w:jc w:val="center"/>
-        <w:tblLook w:firstColumn="1" w:firstRow="1" w:lastColumn="0" w:lastRow="0" w:noHBand="0" w:noVBand="1" w:val="04A0"/>
-      </w:tblPr>
-      <w:tblGrid>
-        <w:gridCol w:w="4320"/>
-        <w:gridCol w:w="4320"/>
-      </w:tblGrid>
-      <w:tr>
-        <w:tc>
-          <w:tcPr>
-            <w:tcW w:type="dxa" w:w="3312"/>
-            <w:shd w:fill="1F3B57"/>
-          </w:tcPr>
-          <w:p>
-            <w:r>
-              <w:rPr>
-                <w:rFonts w:ascii="Tahoma" w:hAnsi="Tahoma" w:cs="Tahoma"/>
-                <w:szCs w:val="21"/>
-              </w:rPr>
-            </w:r>
-            <w:r>
-              <w:rPr>
-                <w:rFonts w:ascii="Tahoma" w:hAnsi="Tahoma" w:cs="Tahoma"/>
-                <w:b/>
-                <w:color w:val="FFFFFF"/>
-                <w:sz w:val="20"/>
-                <w:szCs w:val="20"/>
-              </w:rPr>
-              <w:t>เงื่อนไข</w:t>
-            </w:r>
-          </w:p>
-        </w:tc>
-        <w:tc>
-          <w:tcPr>
-            <w:tcW w:type="dxa" w:w="5328"/>
-            <w:shd w:fill="1F3B57"/>
-          </w:tcPr>
-          <w:p>
-            <w:r>
-              <w:rPr>
-                <w:rFonts w:ascii="Tahoma" w:hAnsi="Tahoma" w:cs="Tahoma"/>
-                <w:szCs w:val="21"/>
-              </w:rPr>
-            </w:r>
-            <w:r>
-              <w:rPr>
-                <w:rFonts w:ascii="Tahoma" w:hAnsi="Tahoma" w:cs="Tahoma"/>
-                <w:b/>
-                <w:color w:val="FFFFFF"/>
-                <w:sz w:val="20"/>
-                <w:szCs w:val="20"/>
-              </w:rPr>
-              <w:t>ผลลัพธ์</w:t>
-            </w:r>
-          </w:p>
-        </w:tc>
-      </w:tr>
-      <w:tr>
-        <w:tc>
-          <w:tcPr>
-            <w:tcW w:type="dxa" w:w="3312"/>
-          </w:tcPr>
-          <w:p>
-            <w:r>
-              <w:rPr>
-                <w:rFonts w:ascii="Tahoma" w:hAnsi="Tahoma" w:cs="Tahoma"/>
-                <w:szCs w:val="21"/>
-              </w:rPr>
-            </w:r>
-            <w:r>
-              <w:rPr>
-                <w:rFonts w:ascii="Tahoma" w:hAnsi="Tahoma" w:cs="Tahoma"/>
-                <w:sz w:val="20"/>
-                <w:szCs w:val="20"/>
-              </w:rPr>
-              <w:t>vertical_gap ≥ 1000 ft</w:t>
-            </w:r>
-          </w:p>
-        </w:tc>
-        <w:tc>
-          <w:tcPr>
-            <w:tcW w:type="dxa" w:w="5328"/>
-          </w:tcPr>
-          <w:p>
-            <w:r>
-              <w:rPr>
-                <w:rFonts w:ascii="Tahoma" w:hAnsi="Tahoma" w:cs="Tahoma"/>
-                <w:szCs w:val="21"/>
-              </w:rPr>
-            </w:r>
-            <w:r>
-              <w:rPr>
-                <w:rFonts w:ascii="Tahoma" w:hAnsi="Tahoma" w:cs="Tahoma"/>
-                <w:sz w:val="20"/>
-                <w:szCs w:val="20"/>
-              </w:rPr>
-              <w:t>200 CLEAR (ปลอดภัยเสมอ ไม่ว่าแนวนอนจะใกล้เท่าใด)</w:t>
-            </w:r>
-          </w:p>
-        </w:tc>
-      </w:tr>
-      <w:tr>
-        <w:tc>
-          <w:tcPr>
-            <w:tcW w:type="dxa" w:w="3312"/>
-          </w:tcPr>
-          <w:p>
-            <w:r>
-              <w:rPr>
-                <w:rFonts w:ascii="Tahoma" w:hAnsi="Tahoma" w:cs="Tahoma"/>
-                <w:szCs w:val="21"/>
-              </w:rPr>
-            </w:r>
-            <w:r>
-              <w:rPr>
-                <w:rFonts w:ascii="Tahoma" w:hAnsi="Tahoma" w:cs="Tahoma"/>
-                <w:sz w:val="20"/>
-                <w:szCs w:val="20"/>
-              </w:rPr>
-              <w:t>distance &gt; 5.0 nm</w:t>
-            </w:r>
-          </w:p>
-        </w:tc>
-        <w:tc>
-          <w:tcPr>
-            <w:tcW w:type="dxa" w:w="5328"/>
-          </w:tcPr>
-          <w:p>
-            <w:r>
-              <w:rPr>
-                <w:rFonts w:ascii="Tahoma" w:hAnsi="Tahoma" w:cs="Tahoma"/>
-                <w:szCs w:val="21"/>
-              </w:rPr>
-            </w:r>
-            <w:r>
-              <w:rPr>
-                <w:rFonts w:ascii="Tahoma" w:hAnsi="Tahoma" w:cs="Tahoma"/>
-                <w:sz w:val="20"/>
-                <w:szCs w:val="20"/>
-              </w:rPr>
-              <w:t>200 CLEAR</w:t>
-            </w:r>
-          </w:p>
-        </w:tc>
-      </w:tr>
-      <w:tr>
-        <w:tc>
-          <w:tcPr>
-            <w:tcW w:type="dxa" w:w="3312"/>
-          </w:tcPr>
-          <w:p>
-            <w:r>
-              <w:rPr>
-                <w:rFonts w:ascii="Tahoma" w:hAnsi="Tahoma" w:cs="Tahoma"/>
-                <w:szCs w:val="21"/>
-              </w:rPr>
-            </w:r>
-            <w:r>
-              <w:rPr>
-                <w:rFonts w:ascii="Tahoma" w:hAnsi="Tahoma" w:cs="Tahoma"/>
-                <w:sz w:val="20"/>
-                <w:szCs w:val="20"/>
-              </w:rPr>
-              <w:t>2.0 &lt; distance ≤ 5.0 nm</w:t>
-            </w:r>
-          </w:p>
-        </w:tc>
-        <w:tc>
-          <w:tcPr>
-            <w:tcW w:type="dxa" w:w="5328"/>
-          </w:tcPr>
-          <w:p>
-            <w:r>
-              <w:rPr>
-                <w:rFonts w:ascii="Tahoma" w:hAnsi="Tahoma" w:cs="Tahoma"/>
-                <w:szCs w:val="21"/>
-              </w:rPr>
-            </w:r>
-            <w:r>
-              <w:rPr>
-                <w:rFonts w:ascii="Tahoma" w:hAnsi="Tahoma" w:cs="Tahoma"/>
-                <w:sz w:val="20"/>
-                <w:szCs w:val="20"/>
-              </w:rPr>
-              <w:t>300 TA_TRAFFIC</w:t>
-            </w:r>
-          </w:p>
-        </w:tc>
-      </w:tr>
-      <w:tr>
-        <w:tc>
-          <w:tcPr>
-            <w:tcW w:type="dxa" w:w="3312"/>
-          </w:tcPr>
-          <w:p>
-            <w:r>
-              <w:rPr>
-                <w:rFonts w:ascii="Tahoma" w:hAnsi="Tahoma" w:cs="Tahoma"/>
-                <w:szCs w:val="21"/>
-              </w:rPr>
-            </w:r>
-            <w:r>
-              <w:rPr>
-                <w:rFonts w:ascii="Tahoma" w:hAnsi="Tahoma" w:cs="Tahoma"/>
-                <w:sz w:val="20"/>
-                <w:szCs w:val="20"/>
-              </w:rPr>
-              <w:t>0.0 &lt; distance ≤ 2.0 nm</w:t>
-            </w:r>
-          </w:p>
-        </w:tc>
-        <w:tc>
-          <w:tcPr>
-            <w:tcW w:type="dxa" w:w="5328"/>
-          </w:tcPr>
-          <w:p>
-            <w:r>
-              <w:rPr>
-                <w:rFonts w:ascii="Tahoma" w:hAnsi="Tahoma" w:cs="Tahoma"/>
-                <w:szCs w:val="21"/>
-              </w:rPr>
-            </w:r>
-            <w:r>
-              <w:rPr>
-                <w:rFonts w:ascii="Tahoma" w:hAnsi="Tahoma" w:cs="Tahoma"/>
-                <w:sz w:val="20"/>
-                <w:szCs w:val="20"/>
-              </w:rPr>
-              <w:t>401 RA_CLIMB และ 402 RA_DESCEND (ส่งคู่กัน)</w:t>
-            </w:r>
-          </w:p>
-        </w:tc>
-      </w:tr>
-      <w:tr>
-        <w:tc>
-          <w:tcPr>
-            <w:tcW w:type="dxa" w:w="3312"/>
-          </w:tcPr>
-          <w:p>
-            <w:r>
-              <w:rPr>
-                <w:rFonts w:ascii="Tahoma" w:hAnsi="Tahoma" w:cs="Tahoma"/>
-                <w:szCs w:val="21"/>
-              </w:rPr>
-            </w:r>
-            <w:r>
-              <w:rPr>
-                <w:rFonts w:ascii="Tahoma" w:hAnsi="Tahoma" w:cs="Tahoma"/>
-                <w:sz w:val="20"/>
-                <w:szCs w:val="20"/>
-              </w:rPr>
-              <w:t>distance = 0.0 nm</w:t>
-            </w:r>
-          </w:p>
-        </w:tc>
-        <w:tc>
-          <w:tcPr>
-            <w:tcW w:type="dxa" w:w="5328"/>
-          </w:tcPr>
-          <w:p>
-            <w:r>
-              <w:rPr>
-                <w:rFonts w:ascii="Tahoma" w:hAnsi="Tahoma" w:cs="Tahoma"/>
-                <w:szCs w:val="21"/>
-              </w:rPr>
-            </w:r>
-            <w:r>
-              <w:rPr>
-                <w:rFonts w:ascii="Tahoma" w:hAnsi="Tahoma" w:cs="Tahoma"/>
-                <w:sz w:val="20"/>
-                <w:szCs w:val="20"/>
-              </w:rPr>
-              <w:t>500 DISCONNECT</w:t>
-            </w:r>
-          </w:p>
-        </w:tc>
-      </w:tr>
-    </w:tbl>
-    <w:p>
-      <w:pPr>
-        <w:spacing w:after="80"/>
-      </w:pPr>
-    </w:p>
-    <w:p>
-      <w:r>
-        <w:rPr>
-          <w:rFonts w:ascii="Tahoma" w:hAnsi="Tahoma" w:cs="Tahoma"/>
-          <w:b/>
-          <w:szCs w:val="21"/>
-        </w:rPr>
-        <w:t xml:space="preserve">หมายเหตุ: </w:t>
-      </w:r>
-      <w:r>
-        <w:rPr>
-          <w:rFonts w:ascii="Tahoma" w:hAnsi="Tahoma" w:cs="Tahoma"/>
-          <w:szCs w:val="21"/>
-        </w:rPr>
-        <w:t>เงื่อนไข vertical_gap ≥ 1000 ft ถูกตรวจก่อนเงื่อนไขอื่นทั้งหมด ซึ่งสอดคล้องกับหลักการ vertical separation minimum ของการบินจริง ทำให้เครื่องบินสองลำที่อยู่ตำแหน่งแนวนอนซ้อนทับกันพอดี แต่แยกกันทางความสูง 1000 ft ยังถือว่าปลอดภัย</w:t>
+        <w:t>TCASP เลือกใช้ Client-Server เพราะ Server กลางสามารถมองเห็นภาพรวม (Global View) ของเครื่องบินทั้งหมดได้ ทำให้วางแผนการหลบหลีกได้อย่างเป็นระเบียบ คล้ายกับระบบ ATC (Air Traffic Control) ที่ใช้งานจริงในปัจจุบัน</w:t>
       </w:r>
     </w:p>
     <w:p>
@@ -1392,91 +712,70 @@
         <w:pStyle w:val="Heading1"/>
       </w:pPr>
       <w:r>
-        <w:rPr>
-          <w:rFonts w:ascii="Tahoma" w:hAnsi="Tahoma" w:cs="Tahoma"/>
-          <w:szCs w:val="30"/>
-        </w:rPr>
-        <w:t>5. การประสานคำสั่งหลบหลีก (RA Coordination)</w:t>
+        <w:t>6. จุดเด่นของโปรเจค</w:t>
       </w:r>
     </w:p>
     <w:p>
       <w:r>
         <w:rPr>
-          <w:rFonts w:ascii="Tahoma" w:hAnsi="Tahoma" w:cs="Tahoma"/>
-          <w:szCs w:val="21"/>
+          <w:b/>
         </w:rPr>
-        <w:t>จุดสำคัญของการออกแบบคือ เมื่อเข้าเงื่อนไข RA server จะไม่ตอบเฉพาะเครื่องที่ส่ง PING เข้ามา แต่จะ broadcast คำสั่งไปยังเครื่องบินทั้งสองลำในคราวเดียว โดยลำหนึ่งได้ RA_CLIMB และอีกลำได้ RA_DESCEND เสมอ</w:t>
+        <w:t xml:space="preserve">• Multi-Threading Client (ใช้หลาย Thread): </w:t>
+      </w:r>
+      <w:r>
+        <w:t>Client แยกการทำงานส่ง (Send) และรับ (Receive) ออกเป็น 2 Thread อิสระ Thread รับจะคอยฟังคำเตือนจาก Server ตลอดเวลาโดยไม่ถูก sleep() บล็อค นอกจากนี้ยังเก็บสถานะ "กรณีร้ายแรงที่สุด" (Worst-case) ไว้ เพื่อให้เครื่องบินตอบสนองต่อคำแนะนำที่วิกฤตที่สุดเสมอ</w:t>
+      </w:r>
+    </w:p>
+    <w:p>
+      <w:r>
+        <w:rPr>
+          <w:b/>
+        </w:rPr>
+        <w:t xml:space="preserve">• รองรับเครื่องบินหลายลำ (N-Aircraft Support): </w:t>
+      </w:r>
+      <w:r>
+        <w:t>Server ใช้ลูปซ้อน (Pairwise Comparison) คำนวณระยะห่างระหว่างเครื่องบินทุกคู่ ไม่ว่าจะมี 2 หรือ 200 ลำก็รองรับได้หมด</w:t>
+      </w:r>
+    </w:p>
+    <w:p>
+      <w:r>
+        <w:rPr>
+          <w:b/>
+        </w:rPr>
+        <w:t xml:space="preserve">• แจ้งเตือนแบบ Safety-Aware: </w:t>
+      </w:r>
+      <w:r>
+        <w:t>เมื่อตรวจพบสถานการณ์อันตราย (TA/RA/CRASH) Server จะส่งแจ้งเตือนไปยังเครื่องบินทั้งสองลำที่เกี่ยวข้องพร้อมกันทันที แต่สถานะ CLEAR จะตอบกลับเฉพาะลำที่ส่ง PING มา เพื่อประหยัด Bandwidth</w:t>
+      </w:r>
+    </w:p>
+    <w:p>
+      <w:r>
+        <w:rPr>
+          <w:b/>
+        </w:rPr>
+        <w:t xml:space="preserve">• Error Handling (การจัดการข้อผิดพลาด): </w:t>
+      </w:r>
+      <w:r>
+        <w:t>Server ตรวจสอบข้อมูลที่เข้ามาด้วย try-except ถ้า Client ส่งค่าพิกัดผิดรูปแบบ Server จะตอบกลับ 400 BAD_REQUEST โดยไม่ทำให้ตัว Server พัง (Graceful Degradation)</w:t>
+      </w:r>
+    </w:p>
+    <w:p>
+      <w:r>
+        <w:rPr>
+          <w:b/>
+        </w:rPr>
+        <w:t xml:space="preserve">• Protocol Versioning และ Sequence Number: </w:t>
+      </w:r>
+      <w:r>
+        <w:t>TCASP/1.0 มีหมายเลขเวอร์ชันเพื่อรองรับการอัพเกรดในอนาคต และมี Sequence Number เพื่อตรวจจับ Packet ที่สูญหายหรือสลับลำดับ</w:t>
       </w:r>
     </w:p>
     <w:p>
       <w:pPr>
-        <w:pStyle w:val="ListBullet"/>
+        <w:pStyle w:val="Heading1"/>
       </w:pPr>
       <w:r>
-        <w:rPr>
-          <w:rFonts w:ascii="Tahoma" w:hAnsi="Tahoma" w:cs="Tahoma"/>
-          <w:b w:val="0"/>
-          <w:szCs w:val="21"/>
-        </w:rPr>
-        <w:t xml:space="preserve">รับประกันว่าทั้งสองลำ </w:t>
-      </w:r>
-      <w:r>
-        <w:rPr>
-          <w:rFonts w:ascii="Tahoma" w:hAnsi="Tahoma" w:cs="Tahoma"/>
-          <w:b/>
-          <w:szCs w:val="21"/>
-        </w:rPr>
-        <w:t>ไม่หลบไปในทิศทางเดียวกัน</w:t>
-      </w:r>
-      <w:r>
-        <w:rPr>
-          <w:rFonts w:ascii="Tahoma" w:hAnsi="Tahoma" w:cs="Tahoma"/>
-          <w:b w:val="0"/>
-          <w:szCs w:val="21"/>
-        </w:rPr>
-        <w:t xml:space="preserve"> ซึ่งจะทำให้ยังชนกันอยู่</w:t>
-      </w:r>
-    </w:p>
-    <w:p>
-      <w:pPr>
-        <w:pStyle w:val="ListBullet"/>
-      </w:pPr>
-      <w:r>
-        <w:rPr>
-          <w:rFonts w:ascii="Tahoma" w:hAnsi="Tahoma" w:cs="Tahoma"/>
-          <w:b w:val="0"/>
-          <w:szCs w:val="21"/>
-        </w:rPr>
-        <w:t xml:space="preserve">ได้ระยะแยกกันเป็น </w:t>
-      </w:r>
-      <w:r>
-        <w:rPr>
-          <w:rFonts w:ascii="Tahoma" w:hAnsi="Tahoma" w:cs="Tahoma"/>
-          <w:b/>
-          <w:szCs w:val="21"/>
-        </w:rPr>
-        <w:t>2000 ft</w:t>
-      </w:r>
-      <w:r>
-        <w:rPr>
-          <w:rFonts w:ascii="Tahoma" w:hAnsi="Tahoma" w:cs="Tahoma"/>
-          <w:b w:val="0"/>
-          <w:szCs w:val="21"/>
-        </w:rPr>
-        <w:t xml:space="preserve"> (ลำหนึ่งขึ้น 1000 อีกลำลง 1000) เทียบกับการหลบข้างเดียวที่ได้เพียง 1000 ft</w:t>
-      </w:r>
-    </w:p>
-    <w:p>
-      <w:pPr>
-        <w:pStyle w:val="ListBullet"/>
-      </w:pPr>
-      <w:r>
-        <w:rPr>
-          <w:rFonts w:ascii="Tahoma" w:hAnsi="Tahoma" w:cs="Tahoma"/>
-          <w:b w:val="0"/>
-          <w:szCs w:val="21"/>
-        </w:rPr>
-        <w:t>กรณี CLEAR และ TA จะตอบเฉพาะเครื่องที่ส่ง PING เข้ามา เพื่อไม่ให้มีข้อความเกินความจำเป็น</w:t>
+        <w:t>7. วิธีรันโปรแกรม</w:t>
       </w:r>
     </w:p>
     <w:p>
@@ -1484,177 +783,63 @@
         <w:pStyle w:val="Heading2"/>
       </w:pPr>
       <w:r>
-        <w:rPr>
-          <w:rFonts w:ascii="Tahoma" w:hAnsi="Tahoma" w:cs="Tahoma"/>
-          <w:szCs w:val="25"/>
-        </w:rPr>
-        <w:t>ผลกระทบต่อฝั่ง Client</w:t>
-      </w:r>
-    </w:p>
-    <w:p>
-      <w:r>
-        <w:rPr>
-          <w:rFonts w:ascii="Tahoma" w:hAnsi="Tahoma" w:cs="Tahoma"/>
-          <w:szCs w:val="21"/>
-        </w:rPr>
-        <w:t>เมื่อ server broadcast แล้ว client จะได้รับ datagram มากกว่าหนึ่งชิ้นต่อรอบ หากอ่านเพียงครั้งเดียวต่อรอบ ข้อความจะค้างสะสมในคิวและทำให้ client อ่านข้อมูลที่ล้าหลัง จึงต้องกำหนด timeout แล้วไล่อ่านจนคิวว่าง โดยยึดข้อความล่าสุดเป็นสถานะปัจจุบัน</w:t>
+        <w:t>เริ่ม Server:</w:t>
       </w:r>
     </w:p>
     <w:p>
       <w:pPr>
-        <w:pStyle w:val="CodeBlock"/>
-        <w:spacing w:after="0" w:before="0"/>
+        <w:pStyle w:val="IntenseQuote"/>
       </w:pPr>
       <w:r>
-        <w:rPr>
-          <w:rFonts w:ascii="Consolas" w:hAnsi="Consolas" w:cs="Tahoma"/>
-          <w:szCs w:val="18"/>
-        </w:rPr>
-        <w:t>socketClient.settimeout(0.5)</w:t>
+        <w:t>python src2/tcasServer.py</w:t>
       </w:r>
     </w:p>
     <w:p>
       <w:pPr>
-        <w:pStyle w:val="CodeBlock"/>
-        <w:spacing w:after="0" w:before="0"/>
+        <w:pStyle w:val="Heading2"/>
       </w:pPr>
       <w:r>
-        <w:rPr>
-          <w:rFonts w:ascii="Consolas" w:hAnsi="Consolas" w:cs="Tahoma"/>
-          <w:szCs w:val="18"/>
-        </w:rPr>
-        <w:t>...</w:t>
+        <w:t>เริ่ม Client (โหมดปกติ — หลบหลีก):</w:t>
       </w:r>
     </w:p>
     <w:p>
       <w:pPr>
-        <w:pStyle w:val="CodeBlock"/>
-        <w:spacing w:after="0" w:before="0"/>
+        <w:pStyle w:val="IntenseQuote"/>
       </w:pPr>
       <w:r>
-        <w:rPr>
-          <w:rFonts w:ascii="Consolas" w:hAnsi="Consolas" w:cs="Tahoma"/>
-          <w:szCs w:val="18"/>
-        </w:rPr>
-        <w:t>response = ""</w:t>
+        <w:t>python src2/tcasClient.py --flight FD3020 --x 4.0 --y 32000.0 --z 0.0 --dx -1.0</w:t>
       </w:r>
     </w:p>
     <w:p>
       <w:pPr>
-        <w:pStyle w:val="CodeBlock"/>
-        <w:spacing w:after="0" w:before="0"/>
+        <w:pStyle w:val="IntenseQuote"/>
       </w:pPr>
       <w:r>
-        <w:rPr>
-          <w:rFonts w:ascii="Consolas" w:hAnsi="Consolas" w:cs="Tahoma"/>
-          <w:szCs w:val="18"/>
-        </w:rPr>
-        <w:t>while True:</w:t>
+        <w:t>python src2/tcasClient.py --flight TG611 --x -4.0 --y 32000.0 --z 0.0 --dx 1.0</w:t>
       </w:r>
     </w:p>
     <w:p>
       <w:pPr>
-        <w:pStyle w:val="CodeBlock"/>
-        <w:spacing w:after="0" w:before="0"/>
+        <w:pStyle w:val="Heading2"/>
       </w:pPr>
       <w:r>
-        <w:rPr>
-          <w:rFonts w:ascii="Consolas" w:hAnsi="Consolas" w:cs="Tahoma"/>
-          <w:szCs w:val="18"/>
-        </w:rPr>
-        <w:t xml:space="preserve">    try:</w:t>
+        <w:t>เริ่ม Client (โหมด Crash — ไม่ยอมหลบ):</w:t>
       </w:r>
     </w:p>
     <w:p>
       <w:pPr>
-        <w:pStyle w:val="CodeBlock"/>
-        <w:spacing w:after="0" w:before="0"/>
+        <w:pStyle w:val="IntenseQuote"/>
       </w:pPr>
       <w:r>
-        <w:rPr>
-          <w:rFonts w:ascii="Consolas" w:hAnsi="Consolas" w:cs="Tahoma"/>
-          <w:szCs w:val="18"/>
-        </w:rPr>
-        <w:t xml:space="preserve">        data, addr = socketClient.recvfrom(1024)</w:t>
+        <w:t>python src2/tcasClient.py --flight CC201 --x 3.0 --y 32000.0 --z 0.0 --dx -1.0 --crash</w:t>
       </w:r>
     </w:p>
     <w:p>
       <w:pPr>
-        <w:pStyle w:val="CodeBlock"/>
-        <w:spacing w:after="0" w:before="0"/>
+        <w:pStyle w:val="IntenseQuote"/>
       </w:pPr>
       <w:r>
-        <w:rPr>
-          <w:rFonts w:ascii="Consolas" w:hAnsi="Consolas" w:cs="Tahoma"/>
-          <w:szCs w:val="18"/>
-        </w:rPr>
-        <w:t xml:space="preserve">        response = data.decode("utf-8")</w:t>
-      </w:r>
-    </w:p>
-    <w:p>
-      <w:pPr>
-        <w:pStyle w:val="CodeBlock"/>
-        <w:spacing w:after="0" w:before="0"/>
-      </w:pPr>
-      <w:r>
-        <w:rPr>
-          <w:rFonts w:ascii="Consolas" w:hAnsi="Consolas" w:cs="Tahoma"/>
-          <w:szCs w:val="18"/>
-        </w:rPr>
-        <w:t xml:space="preserve">        if "DISCONNECT" in response:</w:t>
-      </w:r>
-    </w:p>
-    <w:p>
-      <w:pPr>
-        <w:pStyle w:val="CodeBlock"/>
-        <w:spacing w:after="0" w:before="0"/>
-      </w:pPr>
-      <w:r>
-        <w:rPr>
-          <w:rFonts w:ascii="Consolas" w:hAnsi="Consolas" w:cs="Tahoma"/>
-          <w:szCs w:val="18"/>
-        </w:rPr>
-        <w:t xml:space="preserve">            break</w:t>
-      </w:r>
-    </w:p>
-    <w:p>
-      <w:pPr>
-        <w:pStyle w:val="CodeBlock"/>
-        <w:spacing w:after="0" w:before="0"/>
-      </w:pPr>
-      <w:r>
-        <w:rPr>
-          <w:rFonts w:ascii="Consolas" w:hAnsi="Consolas" w:cs="Tahoma"/>
-          <w:szCs w:val="18"/>
-        </w:rPr>
-        <w:t xml:space="preserve">    except socket.timeout:</w:t>
-      </w:r>
-    </w:p>
-    <w:p>
-      <w:pPr>
-        <w:pStyle w:val="CodeBlock"/>
-        <w:spacing w:after="0" w:before="0"/>
-      </w:pPr>
-      <w:r>
-        <w:rPr>
-          <w:rFonts w:ascii="Consolas" w:hAnsi="Consolas" w:cs="Tahoma"/>
-          <w:szCs w:val="18"/>
-        </w:rPr>
-        <w:t xml:space="preserve">        break</w:t>
-      </w:r>
-    </w:p>
-    <w:p>
-      <w:pPr>
-        <w:spacing w:after="80"/>
-      </w:pPr>
-    </w:p>
-    <w:p>
-      <w:r>
-        <w:rPr>
-          <w:rFonts w:ascii="Tahoma" w:hAnsi="Tahoma" w:cs="Tahoma"/>
-          <w:szCs w:val="21"/>
-        </w:rPr>
-        <w:t>การทิ้งข้อความเก่าเป็นพฤติกรรมที่ถูกต้องสำหรับข้อมูลประเภท state update เพราะข้อมูลตำแหน่งที่ล้าสมัยไม่มีประโยชน์ต่อการตัดสินใจอีกต่อไป</w:t>
+        <w:t>python src2/tcasClient.py --flight CC202 --x -3.0 --y 32000.0 --z 0.0 --dx 1.0 --crash</w:t>
       </w:r>
     </w:p>
     <w:p>
@@ -1662,1680 +847,23 @@
         <w:pStyle w:val="Heading1"/>
       </w:pPr>
       <w:r>
-        <w:rPr>
-          <w:rFonts w:ascii="Tahoma" w:hAnsi="Tahoma" w:cs="Tahoma"/>
-          <w:szCs w:val="30"/>
-        </w:rPr>
-        <w:t>6. พฤติกรรมของ Client</w:t>
-      </w:r>
-    </w:p>
-    <w:tbl>
-      <w:tblPr>
-        <w:tblStyle w:val="TableGrid"/>
-        <w:tblW w:type="auto" w:w="0"/>
-        <w:jc w:val="center"/>
-        <w:tblLook w:firstColumn="1" w:firstRow="1" w:lastColumn="0" w:lastRow="0" w:noHBand="0" w:noVBand="1" w:val="04A0"/>
-      </w:tblPr>
-      <w:tblGrid>
-        <w:gridCol w:w="4320"/>
-        <w:gridCol w:w="4320"/>
-      </w:tblGrid>
-      <w:tr>
-        <w:tc>
-          <w:tcPr>
-            <w:tcW w:type="dxa" w:w="3600"/>
-            <w:shd w:fill="1F3B57"/>
-          </w:tcPr>
-          <w:p>
-            <w:r>
-              <w:rPr>
-                <w:rFonts w:ascii="Tahoma" w:hAnsi="Tahoma" w:cs="Tahoma"/>
-                <w:szCs w:val="21"/>
-              </w:rPr>
-            </w:r>
-            <w:r>
-              <w:rPr>
-                <w:rFonts w:ascii="Tahoma" w:hAnsi="Tahoma" w:cs="Tahoma"/>
-                <w:b/>
-                <w:color w:val="FFFFFF"/>
-                <w:sz w:val="20"/>
-                <w:szCs w:val="20"/>
-              </w:rPr>
-              <w:t>Response ที่ได้รับ</w:t>
-            </w:r>
-          </w:p>
-        </w:tc>
-        <w:tc>
-          <w:tcPr>
-            <w:tcW w:type="dxa" w:w="5040"/>
-            <w:shd w:fill="1F3B57"/>
-          </w:tcPr>
-          <w:p>
-            <w:r>
-              <w:rPr>
-                <w:rFonts w:ascii="Tahoma" w:hAnsi="Tahoma" w:cs="Tahoma"/>
-                <w:szCs w:val="21"/>
-              </w:rPr>
-            </w:r>
-            <w:r>
-              <w:rPr>
-                <w:rFonts w:ascii="Tahoma" w:hAnsi="Tahoma" w:cs="Tahoma"/>
-                <w:b/>
-                <w:color w:val="FFFFFF"/>
-                <w:sz w:val="20"/>
-                <w:szCs w:val="20"/>
-              </w:rPr>
-              <w:t>การตอบสนอง</w:t>
-            </w:r>
-          </w:p>
-        </w:tc>
-      </w:tr>
-      <w:tr>
-        <w:tc>
-          <w:tcPr>
-            <w:tcW w:type="dxa" w:w="3600"/>
-          </w:tcPr>
-          <w:p>
-            <w:r>
-              <w:rPr>
-                <w:rFonts w:ascii="Tahoma" w:hAnsi="Tahoma" w:cs="Tahoma"/>
-                <w:szCs w:val="21"/>
-              </w:rPr>
-            </w:r>
-            <w:r>
-              <w:rPr>
-                <w:rFonts w:ascii="Tahoma" w:hAnsi="Tahoma" w:cs="Tahoma"/>
-                <w:sz w:val="20"/>
-                <w:szCs w:val="20"/>
-              </w:rPr>
-              <w:t>401 RA_CLIMB</w:t>
-            </w:r>
-          </w:p>
-        </w:tc>
-        <w:tc>
-          <w:tcPr>
-            <w:tcW w:type="dxa" w:w="5040"/>
-          </w:tcPr>
-          <w:p>
-            <w:r>
-              <w:rPr>
-                <w:rFonts w:ascii="Tahoma" w:hAnsi="Tahoma" w:cs="Tahoma"/>
-                <w:szCs w:val="21"/>
-              </w:rPr>
-            </w:r>
-            <w:r>
-              <w:rPr>
-                <w:rFonts w:ascii="Tahoma" w:hAnsi="Tahoma" w:cs="Tahoma"/>
-                <w:sz w:val="20"/>
-                <w:szCs w:val="20"/>
-              </w:rPr>
-              <w:t>posY += 1000</w:t>
-            </w:r>
-          </w:p>
-        </w:tc>
-      </w:tr>
-      <w:tr>
-        <w:tc>
-          <w:tcPr>
-            <w:tcW w:type="dxa" w:w="3600"/>
-          </w:tcPr>
-          <w:p>
-            <w:r>
-              <w:rPr>
-                <w:rFonts w:ascii="Tahoma" w:hAnsi="Tahoma" w:cs="Tahoma"/>
-                <w:szCs w:val="21"/>
-              </w:rPr>
-            </w:r>
-            <w:r>
-              <w:rPr>
-                <w:rFonts w:ascii="Tahoma" w:hAnsi="Tahoma" w:cs="Tahoma"/>
-                <w:sz w:val="20"/>
-                <w:szCs w:val="20"/>
-              </w:rPr>
-              <w:t>402 RA_DESCEND</w:t>
-            </w:r>
-          </w:p>
-        </w:tc>
-        <w:tc>
-          <w:tcPr>
-            <w:tcW w:type="dxa" w:w="5040"/>
-          </w:tcPr>
-          <w:p>
-            <w:r>
-              <w:rPr>
-                <w:rFonts w:ascii="Tahoma" w:hAnsi="Tahoma" w:cs="Tahoma"/>
-                <w:szCs w:val="21"/>
-              </w:rPr>
-            </w:r>
-            <w:r>
-              <w:rPr>
-                <w:rFonts w:ascii="Tahoma" w:hAnsi="Tahoma" w:cs="Tahoma"/>
-                <w:sz w:val="20"/>
-                <w:szCs w:val="20"/>
-              </w:rPr>
-              <w:t>posY -= 1000</w:t>
-            </w:r>
-          </w:p>
-        </w:tc>
-      </w:tr>
-      <w:tr>
-        <w:tc>
-          <w:tcPr>
-            <w:tcW w:type="dxa" w:w="3600"/>
-          </w:tcPr>
-          <w:p>
-            <w:r>
-              <w:rPr>
-                <w:rFonts w:ascii="Tahoma" w:hAnsi="Tahoma" w:cs="Tahoma"/>
-                <w:szCs w:val="21"/>
-              </w:rPr>
-            </w:r>
-            <w:r>
-              <w:rPr>
-                <w:rFonts w:ascii="Tahoma" w:hAnsi="Tahoma" w:cs="Tahoma"/>
-                <w:sz w:val="20"/>
-                <w:szCs w:val="20"/>
-              </w:rPr>
-              <w:t>500 DISCONNECT</w:t>
-            </w:r>
-          </w:p>
-        </w:tc>
-        <w:tc>
-          <w:tcPr>
-            <w:tcW w:type="dxa" w:w="5040"/>
-          </w:tcPr>
-          <w:p>
-            <w:r>
-              <w:rPr>
-                <w:rFonts w:ascii="Tahoma" w:hAnsi="Tahoma" w:cs="Tahoma"/>
-                <w:szCs w:val="21"/>
-              </w:rPr>
-            </w:r>
-            <w:r>
-              <w:rPr>
-                <w:rFonts w:ascii="Tahoma" w:hAnsi="Tahoma" w:cs="Tahoma"/>
-                <w:sz w:val="20"/>
-                <w:szCs w:val="20"/>
-              </w:rPr>
-              <w:t>ออกจาก loop และปิด socket</w:t>
-            </w:r>
-          </w:p>
-        </w:tc>
-      </w:tr>
-      <w:tr>
-        <w:tc>
-          <w:tcPr>
-            <w:tcW w:type="dxa" w:w="3600"/>
-          </w:tcPr>
-          <w:p>
-            <w:r>
-              <w:rPr>
-                <w:rFonts w:ascii="Tahoma" w:hAnsi="Tahoma" w:cs="Tahoma"/>
-                <w:szCs w:val="21"/>
-              </w:rPr>
-            </w:r>
-            <w:r>
-              <w:rPr>
-                <w:rFonts w:ascii="Tahoma" w:hAnsi="Tahoma" w:cs="Tahoma"/>
-                <w:sz w:val="20"/>
-                <w:szCs w:val="20"/>
-              </w:rPr>
-              <w:t>200 / 300</w:t>
-            </w:r>
-          </w:p>
-        </w:tc>
-        <w:tc>
-          <w:tcPr>
-            <w:tcW w:type="dxa" w:w="5040"/>
-          </w:tcPr>
-          <w:p>
-            <w:r>
-              <w:rPr>
-                <w:rFonts w:ascii="Tahoma" w:hAnsi="Tahoma" w:cs="Tahoma"/>
-                <w:szCs w:val="21"/>
-              </w:rPr>
-            </w:r>
-            <w:r>
-              <w:rPr>
-                <w:rFonts w:ascii="Tahoma" w:hAnsi="Tahoma" w:cs="Tahoma"/>
-                <w:sz w:val="20"/>
-                <w:szCs w:val="20"/>
-              </w:rPr>
-              <w:t>บินตามเส้นทางเดิมต่อไป</w:t>
-            </w:r>
-          </w:p>
-        </w:tc>
-      </w:tr>
-    </w:tbl>
-    <w:p>
-      <w:pPr>
-        <w:spacing w:after="80"/>
-      </w:pPr>
-    </w:p>
-    <w:p>
-      <w:pPr>
-        <w:pStyle w:val="Heading1"/>
-      </w:pPr>
-      <w:r>
-        <w:rPr>
-          <w:rFonts w:ascii="Tahoma" w:hAnsi="Tahoma" w:cs="Tahoma"/>
-          <w:szCs w:val="30"/>
-        </w:rPr>
-        <w:t>7. ผลการทดสอบ</w:t>
-      </w:r>
-    </w:p>
-    <w:p>
-      <w:pPr>
-        <w:pStyle w:val="Heading2"/>
-      </w:pPr>
-      <w:r>
-        <w:rPr>
-          <w:rFonts w:ascii="Tahoma" w:hAnsi="Tahoma" w:cs="Tahoma"/>
-          <w:szCs w:val="25"/>
-        </w:rPr>
-        <w:t>7.1 กรณีหลบหลีกสำเร็จ</w:t>
+        <w:t>8. การตรวจสอบด้วย Wireshark</w:t>
       </w:r>
     </w:p>
     <w:p>
       <w:r>
-        <w:rPr>
-          <w:rFonts w:ascii="Tahoma" w:hAnsi="Tahoma" w:cs="Tahoma"/>
-          <w:szCs w:val="21"/>
-        </w:rPr>
-        <w:t>ใช้ tcasClient1.py (FD3020) และ tcasClient2.py (TG611) ซึ่งปฏิบัติตามคำสั่ง RA เริ่มต้นที่ posX = +4.0 และ −4.0 บินเข้าหากันทีละ 1 nm ทุก 2 วินาที</w:t>
+        <w:t>ขั้นตอนการ Capture TCASP Packets ด้วย Wireshark:</w:t>
+        <w:br/>
+        <w:t>1. เปิด Wireshark แล้วเลือก Interface "Loopback: lo0" (เพราะเราใช้ 127.0.0.1)</w:t>
+        <w:br/>
+        <w:t>2. ตั้ง Display Filter: udp.port == 8080</w:t>
+        <w:br/>
+        <w:t>3. รัน Server และ Client ตามปกติ</w:t>
+        <w:br/>
+        <w:t>4. สังเกต TCASP Request/Response ที่แสดงเป็น Plain Text อ่านง่าย</w:t>
+        <w:br/>
+        <w:t>5. คลิกขวาที่ Packet → Follow → UDP Stream เพื่อดูบทสนทนาทั้งหมด</w:t>
       </w:r>
-    </w:p>
-    <w:p>
-      <w:pPr>
-        <w:pStyle w:val="CodeBlock"/>
-        <w:spacing w:after="0" w:before="0"/>
-      </w:pPr>
-      <w:r>
-        <w:rPr>
-          <w:rFonts w:ascii="Consolas" w:hAnsi="Consolas" w:cs="Tahoma"/>
-          <w:szCs w:val="18"/>
-        </w:rPr>
-        <w:t>distance = 2.00 nm   gap =    0 ft   -&gt;  TG611 : 401 RA_CLIMB</w:t>
-      </w:r>
-    </w:p>
-    <w:p>
-      <w:pPr>
-        <w:pStyle w:val="CodeBlock"/>
-        <w:spacing w:after="0" w:before="0"/>
-      </w:pPr>
-      <w:r>
-        <w:rPr>
-          <w:rFonts w:ascii="Consolas" w:hAnsi="Consolas" w:cs="Tahoma"/>
-          <w:szCs w:val="18"/>
-        </w:rPr>
-        <w:t xml:space="preserve">                                         FD3020: 402 RA_DESCEND</w:t>
-      </w:r>
-    </w:p>
-    <w:p>
-      <w:pPr>
-        <w:pStyle w:val="CodeBlock"/>
-        <w:spacing w:after="0" w:before="0"/>
-      </w:pPr>
-      <w:r>
-        <w:rPr>
-          <w:rFonts w:ascii="Consolas" w:hAnsi="Consolas" w:cs="Tahoma"/>
-          <w:szCs w:val="18"/>
-        </w:rPr>
-        <w:t>distance = 1.00 nm   gap = 1000 ft   -&gt;  TG611 ไต่ขึ้นเป็น 33000 ft</w:t>
-      </w:r>
-    </w:p>
-    <w:p>
-      <w:pPr>
-        <w:pStyle w:val="CodeBlock"/>
-        <w:spacing w:after="0" w:before="0"/>
-      </w:pPr>
-      <w:r>
-        <w:rPr>
-          <w:rFonts w:ascii="Consolas" w:hAnsi="Consolas" w:cs="Tahoma"/>
-          <w:szCs w:val="18"/>
-        </w:rPr>
-        <w:t>distance = 0.00 nm   gap = 2000 ft   -&gt;  200 CLEAR (ผ่านกันได้อย่างปลอดภัย)</w:t>
-      </w:r>
-    </w:p>
-    <w:p>
-      <w:pPr>
-        <w:spacing w:after="80"/>
-      </w:pPr>
-    </w:p>
-    <w:p>
-      <w:r>
-        <w:rPr>
-          <w:rFonts w:ascii="Tahoma" w:hAnsi="Tahoma" w:cs="Tahoma"/>
-          <w:szCs w:val="21"/>
-        </w:rPr>
-        <w:t>ผลลัพธ์: เครื่องบินทั้งสองลำอยู่ตำแหน่งแนวนอนตรงกันพอดี (distance = 0.00 nm) แต่แยกกันทางความสูงถึง 2000 ft จึงไม่เกิดการชน</w:t>
-      </w:r>
-    </w:p>
-    <w:p>
-      <w:pPr>
-        <w:pStyle w:val="Heading2"/>
-      </w:pPr>
-      <w:r>
-        <w:rPr>
-          <w:rFonts w:ascii="Tahoma" w:hAnsi="Tahoma" w:cs="Tahoma"/>
-          <w:szCs w:val="25"/>
-        </w:rPr>
-        <w:t>7.2 กรณีเกิดการชน</w:t>
-      </w:r>
-    </w:p>
-    <w:p>
-      <w:r>
-        <w:rPr>
-          <w:rFonts w:ascii="Tahoma" w:hAnsi="Tahoma" w:cs="Tahoma"/>
-          <w:szCs w:val="21"/>
-        </w:rPr>
-        <w:t>ใช้ tcasCrashClient1.py (CC201) และ tcasCrashClient2.py (CC202) ซึ่งจงใจ ไม่ปฏิบัติตามคำสั่ง RA เพื่อทดสอบว่าโปรโตคอลตรวจจับและจัดการการชนได้ถูกต้อง</w:t>
-      </w:r>
-    </w:p>
-    <w:p>
-      <w:pPr>
-        <w:pStyle w:val="CodeBlock"/>
-        <w:spacing w:after="0" w:before="0"/>
-      </w:pPr>
-      <w:r>
-        <w:rPr>
-          <w:rFonts w:ascii="Consolas" w:hAnsi="Consolas" w:cs="Tahoma"/>
-          <w:szCs w:val="18"/>
-        </w:rPr>
-        <w:t>distance = 2.00 nm   gap = 0 ft   -&gt;  401 RA_CLIMB / 402 RA_DESCEND  (เพิกเฉย)</w:t>
-      </w:r>
-    </w:p>
-    <w:p>
-      <w:pPr>
-        <w:pStyle w:val="CodeBlock"/>
-        <w:spacing w:after="0" w:before="0"/>
-      </w:pPr>
-      <w:r>
-        <w:rPr>
-          <w:rFonts w:ascii="Consolas" w:hAnsi="Consolas" w:cs="Tahoma"/>
-          <w:szCs w:val="18"/>
-        </w:rPr>
-        <w:t>distance = 1.00 nm   gap = 0 ft   -&gt;  401 RA_CLIMB / 402 RA_DESCEND  (เพิกเฉย)</w:t>
-      </w:r>
-    </w:p>
-    <w:p>
-      <w:pPr>
-        <w:pStyle w:val="CodeBlock"/>
-        <w:spacing w:after="0" w:before="0"/>
-      </w:pPr>
-      <w:r>
-        <w:rPr>
-          <w:rFonts w:ascii="Consolas" w:hAnsi="Consolas" w:cs="Tahoma"/>
-          <w:szCs w:val="18"/>
-        </w:rPr>
-        <w:t>distance = 0.00 nm   gap = 0 ft   -&gt;  500 DISCONNECT CRASHED (ทั้งสองลำ)</w:t>
-      </w:r>
-    </w:p>
-    <w:p>
-      <w:pPr>
-        <w:pStyle w:val="CodeBlock"/>
-        <w:spacing w:after="0" w:before="0"/>
-      </w:pPr>
-      <w:r>
-        <w:rPr>
-          <w:rFonts w:ascii="Consolas" w:hAnsi="Consolas" w:cs="Tahoma"/>
-          <w:szCs w:val="18"/>
-        </w:rPr>
-        <w:t xml:space="preserve">                                      [INFO] ลบออกจาก radar</w:t>
-      </w:r>
-    </w:p>
-    <w:p>
-      <w:pPr>
-        <w:spacing w:after="80"/>
-      </w:pPr>
-    </w:p>
-    <w:p>
-      <w:r>
-        <w:rPr>
-          <w:rFonts w:ascii="Tahoma" w:hAnsi="Tahoma" w:cs="Tahoma"/>
-          <w:szCs w:val="21"/>
-        </w:rPr>
-        <w:t>ผลลัพธ์: server เตือน RA ล่วงหน้าถึงสองรอบ เมื่อไม่มีการปฏิบัติตามจึงเกิดการชน แสดงว่าโปรโตคอลทำหน้าที่ครบถ้วนแล้ว การชนเกิดจากการไม่ปฏิบัติตามคำสั่ง ซึ่งสะท้อนธรรมชาติของ TCAS จริงที่เป็นเพียงระบบให้คำแนะนำ (advisory) การตัดสินใจสุดท้ายอยู่ที่นักบิน</w:t>
-      </w:r>
-    </w:p>
-    <w:p>
-      <w:pPr>
-        <w:pStyle w:val="Heading1"/>
-      </w:pPr>
-      <w:r>
-        <w:rPr>
-          <w:rFonts w:ascii="Tahoma" w:hAnsi="Tahoma" w:cs="Tahoma"/>
-          <w:szCs w:val="30"/>
-        </w:rPr>
-        <w:t>8. เปรียบเทียบกับ TCAS จริง</w:t>
-      </w:r>
-    </w:p>
-    <w:tbl>
-      <w:tblPr>
-        <w:tblStyle w:val="TableGrid"/>
-        <w:tblW w:type="auto" w:w="0"/>
-        <w:jc w:val="center"/>
-        <w:tblLook w:firstColumn="1" w:firstRow="1" w:lastColumn="0" w:lastRow="0" w:noHBand="0" w:noVBand="1" w:val="04A0"/>
-      </w:tblPr>
-      <w:tblGrid>
-        <w:gridCol w:w="2880"/>
-        <w:gridCol w:w="2880"/>
-        <w:gridCol w:w="2880"/>
-      </w:tblGrid>
-      <w:tr>
-        <w:tc>
-          <w:tcPr>
-            <w:tcW w:type="dxa" w:w="1872"/>
-            <w:shd w:fill="1F3B57"/>
-          </w:tcPr>
-          <w:p>
-            <w:r>
-              <w:rPr>
-                <w:rFonts w:ascii="Tahoma" w:hAnsi="Tahoma" w:cs="Tahoma"/>
-                <w:szCs w:val="21"/>
-              </w:rPr>
-            </w:r>
-            <w:r>
-              <w:rPr>
-                <w:rFonts w:ascii="Tahoma" w:hAnsi="Tahoma" w:cs="Tahoma"/>
-                <w:b/>
-                <w:color w:val="FFFFFF"/>
-                <w:sz w:val="20"/>
-                <w:szCs w:val="20"/>
-              </w:rPr>
-              <w:t>ประเด็น</w:t>
-            </w:r>
-          </w:p>
-        </w:tc>
-        <w:tc>
-          <w:tcPr>
-            <w:tcW w:type="dxa" w:w="3384"/>
-            <w:shd w:fill="1F3B57"/>
-          </w:tcPr>
-          <w:p>
-            <w:r>
-              <w:rPr>
-                <w:rFonts w:ascii="Tahoma" w:hAnsi="Tahoma" w:cs="Tahoma"/>
-                <w:szCs w:val="21"/>
-              </w:rPr>
-            </w:r>
-            <w:r>
-              <w:rPr>
-                <w:rFonts w:ascii="Tahoma" w:hAnsi="Tahoma" w:cs="Tahoma"/>
-                <w:b/>
-                <w:color w:val="FFFFFF"/>
-                <w:sz w:val="20"/>
-                <w:szCs w:val="20"/>
-              </w:rPr>
-              <w:t>TCAS จริง</w:t>
-            </w:r>
-          </w:p>
-        </w:tc>
-        <w:tc>
-          <w:tcPr>
-            <w:tcW w:type="dxa" w:w="3384"/>
-            <w:shd w:fill="1F3B57"/>
-          </w:tcPr>
-          <w:p>
-            <w:r>
-              <w:rPr>
-                <w:rFonts w:ascii="Tahoma" w:hAnsi="Tahoma" w:cs="Tahoma"/>
-                <w:szCs w:val="21"/>
-              </w:rPr>
-            </w:r>
-            <w:r>
-              <w:rPr>
-                <w:rFonts w:ascii="Tahoma" w:hAnsi="Tahoma" w:cs="Tahoma"/>
-                <w:b/>
-                <w:color w:val="FFFFFF"/>
-                <w:sz w:val="20"/>
-                <w:szCs w:val="20"/>
-              </w:rPr>
-              <w:t>TCASP (โปรเจกต์นี้)</w:t>
-            </w:r>
-          </w:p>
-        </w:tc>
-      </w:tr>
-      <w:tr>
-        <w:tc>
-          <w:tcPr>
-            <w:tcW w:type="dxa" w:w="1872"/>
-          </w:tcPr>
-          <w:p>
-            <w:r>
-              <w:rPr>
-                <w:rFonts w:ascii="Tahoma" w:hAnsi="Tahoma" w:cs="Tahoma"/>
-                <w:szCs w:val="21"/>
-              </w:rPr>
-            </w:r>
-            <w:r>
-              <w:rPr>
-                <w:rFonts w:ascii="Tahoma" w:hAnsi="Tahoma" w:cs="Tahoma"/>
-                <w:sz w:val="20"/>
-                <w:szCs w:val="20"/>
-              </w:rPr>
-              <w:t>โครงสร้าง</w:t>
-            </w:r>
-          </w:p>
-        </w:tc>
-        <w:tc>
-          <w:tcPr>
-            <w:tcW w:type="dxa" w:w="3384"/>
-          </w:tcPr>
-          <w:p>
-            <w:r>
-              <w:rPr>
-                <w:rFonts w:ascii="Tahoma" w:hAnsi="Tahoma" w:cs="Tahoma"/>
-                <w:szCs w:val="21"/>
-              </w:rPr>
-            </w:r>
-            <w:r>
-              <w:rPr>
-                <w:rFonts w:ascii="Tahoma" w:hAnsi="Tahoma" w:cs="Tahoma"/>
-                <w:sz w:val="20"/>
-                <w:szCs w:val="20"/>
-              </w:rPr>
-              <w:t>กระจาย (decentralized)</w:t>
-              <w:br/>
-              <w:t>แต่ละเครื่องตัดสินเอง</w:t>
-            </w:r>
-          </w:p>
-        </w:tc>
-        <w:tc>
-          <w:tcPr>
-            <w:tcW w:type="dxa" w:w="3384"/>
-          </w:tcPr>
-          <w:p>
-            <w:r>
-              <w:rPr>
-                <w:rFonts w:ascii="Tahoma" w:hAnsi="Tahoma" w:cs="Tahoma"/>
-                <w:szCs w:val="21"/>
-              </w:rPr>
-            </w:r>
-            <w:r>
-              <w:rPr>
-                <w:rFonts w:ascii="Tahoma" w:hAnsi="Tahoma" w:cs="Tahoma"/>
-                <w:sz w:val="20"/>
-                <w:szCs w:val="20"/>
-              </w:rPr>
-              <w:t>รวมศูนย์ (centralized)</w:t>
-              <w:br/>
-              <w:t>server ตัดสินแล้ว broadcast</w:t>
-            </w:r>
-          </w:p>
-        </w:tc>
-      </w:tr>
-      <w:tr>
-        <w:tc>
-          <w:tcPr>
-            <w:tcW w:type="dxa" w:w="1872"/>
-          </w:tcPr>
-          <w:p>
-            <w:r>
-              <w:rPr>
-                <w:rFonts w:ascii="Tahoma" w:hAnsi="Tahoma" w:cs="Tahoma"/>
-                <w:szCs w:val="21"/>
-              </w:rPr>
-            </w:r>
-            <w:r>
-              <w:rPr>
-                <w:rFonts w:ascii="Tahoma" w:hAnsi="Tahoma" w:cs="Tahoma"/>
-                <w:sz w:val="20"/>
-                <w:szCs w:val="20"/>
-              </w:rPr>
-              <w:t>เกณฑ์เตือน</w:t>
-            </w:r>
-          </w:p>
-        </w:tc>
-        <w:tc>
-          <w:tcPr>
-            <w:tcW w:type="dxa" w:w="3384"/>
-          </w:tcPr>
-          <w:p>
-            <w:r>
-              <w:rPr>
-                <w:rFonts w:ascii="Tahoma" w:hAnsi="Tahoma" w:cs="Tahoma"/>
-                <w:szCs w:val="21"/>
-              </w:rPr>
-            </w:r>
-            <w:r>
-              <w:rPr>
-                <w:rFonts w:ascii="Tahoma" w:hAnsi="Tahoma" w:cs="Tahoma"/>
-                <w:sz w:val="20"/>
-                <w:szCs w:val="20"/>
-              </w:rPr>
-              <w:t>time-to-CPA (tau)</w:t>
-              <w:br/>
-              <w:t>คำนวณจาก velocity vector</w:t>
-            </w:r>
-          </w:p>
-        </w:tc>
-        <w:tc>
-          <w:tcPr>
-            <w:tcW w:type="dxa" w:w="3384"/>
-          </w:tcPr>
-          <w:p>
-            <w:r>
-              <w:rPr>
-                <w:rFonts w:ascii="Tahoma" w:hAnsi="Tahoma" w:cs="Tahoma"/>
-                <w:szCs w:val="21"/>
-              </w:rPr>
-            </w:r>
-            <w:r>
-              <w:rPr>
-                <w:rFonts w:ascii="Tahoma" w:hAnsi="Tahoma" w:cs="Tahoma"/>
-                <w:sz w:val="20"/>
-                <w:szCs w:val="20"/>
-              </w:rPr>
-              <w:t>ระยะคงที่ 5.0 / 2.0 nm</w:t>
-              <w:br/>
-              <w:t>ร่วมกับ vertical gap</w:t>
-            </w:r>
-          </w:p>
-        </w:tc>
-      </w:tr>
-      <w:tr>
-        <w:tc>
-          <w:tcPr>
-            <w:tcW w:type="dxa" w:w="1872"/>
-          </w:tcPr>
-          <w:p>
-            <w:r>
-              <w:rPr>
-                <w:rFonts w:ascii="Tahoma" w:hAnsi="Tahoma" w:cs="Tahoma"/>
-                <w:szCs w:val="21"/>
-              </w:rPr>
-            </w:r>
-            <w:r>
-              <w:rPr>
-                <w:rFonts w:ascii="Tahoma" w:hAnsi="Tahoma" w:cs="Tahoma"/>
-                <w:sz w:val="20"/>
-                <w:szCs w:val="20"/>
-              </w:rPr>
-              <w:t>การประสาน RA</w:t>
-            </w:r>
-          </w:p>
-        </w:tc>
-        <w:tc>
-          <w:tcPr>
-            <w:tcW w:type="dxa" w:w="3384"/>
-          </w:tcPr>
-          <w:p>
-            <w:r>
-              <w:rPr>
-                <w:rFonts w:ascii="Tahoma" w:hAnsi="Tahoma" w:cs="Tahoma"/>
-                <w:szCs w:val="21"/>
-              </w:rPr>
-            </w:r>
-            <w:r>
-              <w:rPr>
-                <w:rFonts w:ascii="Tahoma" w:hAnsi="Tahoma" w:cs="Tahoma"/>
-                <w:sz w:val="20"/>
-                <w:szCs w:val="20"/>
-              </w:rPr>
-              <w:t>ผ่านสัญญาณ Mode S</w:t>
-              <w:br/>
-              <w:t>ระหว่างเครื่องบิน</w:t>
-            </w:r>
-          </w:p>
-        </w:tc>
-        <w:tc>
-          <w:tcPr>
-            <w:tcW w:type="dxa" w:w="3384"/>
-          </w:tcPr>
-          <w:p>
-            <w:r>
-              <w:rPr>
-                <w:rFonts w:ascii="Tahoma" w:hAnsi="Tahoma" w:cs="Tahoma"/>
-                <w:szCs w:val="21"/>
-              </w:rPr>
-            </w:r>
-            <w:r>
-              <w:rPr>
-                <w:rFonts w:ascii="Tahoma" w:hAnsi="Tahoma" w:cs="Tahoma"/>
-                <w:sz w:val="20"/>
-                <w:szCs w:val="20"/>
-              </w:rPr>
-              <w:t>server ออกคำสั่งคู่กัน</w:t>
-              <w:br/>
-              <w:t>ในการทำงานครั้งเดียว</w:t>
-            </w:r>
-          </w:p>
-        </w:tc>
-      </w:tr>
-      <w:tr>
-        <w:tc>
-          <w:tcPr>
-            <w:tcW w:type="dxa" w:w="1872"/>
-          </w:tcPr>
-          <w:p>
-            <w:r>
-              <w:rPr>
-                <w:rFonts w:ascii="Tahoma" w:hAnsi="Tahoma" w:cs="Tahoma"/>
-                <w:szCs w:val="21"/>
-              </w:rPr>
-            </w:r>
-            <w:r>
-              <w:rPr>
-                <w:rFonts w:ascii="Tahoma" w:hAnsi="Tahoma" w:cs="Tahoma"/>
-                <w:sz w:val="20"/>
-                <w:szCs w:val="20"/>
-              </w:rPr>
-              <w:t>ขอบเขตการมองเห็น</w:t>
-            </w:r>
-          </w:p>
-        </w:tc>
-        <w:tc>
-          <w:tcPr>
-            <w:tcW w:type="dxa" w:w="3384"/>
-          </w:tcPr>
-          <w:p>
-            <w:r>
-              <w:rPr>
-                <w:rFonts w:ascii="Tahoma" w:hAnsi="Tahoma" w:cs="Tahoma"/>
-                <w:szCs w:val="21"/>
-              </w:rPr>
-            </w:r>
-            <w:r>
-              <w:rPr>
-                <w:rFonts w:ascii="Tahoma" w:hAnsi="Tahoma" w:cs="Tahoma"/>
-                <w:sz w:val="20"/>
-                <w:szCs w:val="20"/>
-              </w:rPr>
-              <w:t>เฉพาะเครื่องที่รับสัญญาณได้</w:t>
-            </w:r>
-          </w:p>
-        </w:tc>
-        <w:tc>
-          <w:tcPr>
-            <w:tcW w:type="dxa" w:w="3384"/>
-          </w:tcPr>
-          <w:p>
-            <w:r>
-              <w:rPr>
-                <w:rFonts w:ascii="Tahoma" w:hAnsi="Tahoma" w:cs="Tahoma"/>
-                <w:szCs w:val="21"/>
-              </w:rPr>
-            </w:r>
-            <w:r>
-              <w:rPr>
-                <w:rFonts w:ascii="Tahoma" w:hAnsi="Tahoma" w:cs="Tahoma"/>
-                <w:sz w:val="20"/>
-                <w:szCs w:val="20"/>
-              </w:rPr>
-              <w:t>ทุกเครื่องที่ลงทะเบียนไว้</w:t>
-              <w:br/>
-              <w:t>(global view)</w:t>
-            </w:r>
-          </w:p>
-        </w:tc>
-      </w:tr>
-      <w:tr>
-        <w:tc>
-          <w:tcPr>
-            <w:tcW w:type="dxa" w:w="1872"/>
-          </w:tcPr>
-          <w:p>
-            <w:r>
-              <w:rPr>
-                <w:rFonts w:ascii="Tahoma" w:hAnsi="Tahoma" w:cs="Tahoma"/>
-                <w:szCs w:val="21"/>
-              </w:rPr>
-            </w:r>
-            <w:r>
-              <w:rPr>
-                <w:rFonts w:ascii="Tahoma" w:hAnsi="Tahoma" w:cs="Tahoma"/>
-                <w:sz w:val="20"/>
-                <w:szCs w:val="20"/>
-              </w:rPr>
-              <w:t>ข้อมูลที่ใช้</w:t>
-            </w:r>
-          </w:p>
-        </w:tc>
-        <w:tc>
-          <w:tcPr>
-            <w:tcW w:type="dxa" w:w="3384"/>
-          </w:tcPr>
-          <w:p>
-            <w:r>
-              <w:rPr>
-                <w:rFonts w:ascii="Tahoma" w:hAnsi="Tahoma" w:cs="Tahoma"/>
-                <w:szCs w:val="21"/>
-              </w:rPr>
-            </w:r>
-            <w:r>
-              <w:rPr>
-                <w:rFonts w:ascii="Tahoma" w:hAnsi="Tahoma" w:cs="Tahoma"/>
-                <w:sz w:val="20"/>
-                <w:szCs w:val="20"/>
-              </w:rPr>
-              <w:t>ตำแหน่ง + ความเร็ว</w:t>
-              <w:br/>
-              <w:t>+ อัตราไต่ระดับ</w:t>
-            </w:r>
-          </w:p>
-        </w:tc>
-        <w:tc>
-          <w:tcPr>
-            <w:tcW w:type="dxa" w:w="3384"/>
-          </w:tcPr>
-          <w:p>
-            <w:r>
-              <w:rPr>
-                <w:rFonts w:ascii="Tahoma" w:hAnsi="Tahoma" w:cs="Tahoma"/>
-                <w:szCs w:val="21"/>
-              </w:rPr>
-            </w:r>
-            <w:r>
-              <w:rPr>
-                <w:rFonts w:ascii="Tahoma" w:hAnsi="Tahoma" w:cs="Tahoma"/>
-                <w:sz w:val="20"/>
-                <w:szCs w:val="20"/>
-              </w:rPr>
-              <w:t>ตำแหน่งชั่วขณะเท่านั้น</w:t>
-            </w:r>
-          </w:p>
-        </w:tc>
-      </w:tr>
-      <w:tr>
-        <w:tc>
-          <w:tcPr>
-            <w:tcW w:type="dxa" w:w="1872"/>
-          </w:tcPr>
-          <w:p>
-            <w:r>
-              <w:rPr>
-                <w:rFonts w:ascii="Tahoma" w:hAnsi="Tahoma" w:cs="Tahoma"/>
-                <w:szCs w:val="21"/>
-              </w:rPr>
-            </w:r>
-            <w:r>
-              <w:rPr>
-                <w:rFonts w:ascii="Tahoma" w:hAnsi="Tahoma" w:cs="Tahoma"/>
-                <w:sz w:val="20"/>
-                <w:szCs w:val="20"/>
-              </w:rPr>
-              <w:t>สภาพการบังคับ</w:t>
-            </w:r>
-          </w:p>
-        </w:tc>
-        <w:tc>
-          <w:tcPr>
-            <w:tcW w:type="dxa" w:w="3384"/>
-          </w:tcPr>
-          <w:p>
-            <w:r>
-              <w:rPr>
-                <w:rFonts w:ascii="Tahoma" w:hAnsi="Tahoma" w:cs="Tahoma"/>
-                <w:szCs w:val="21"/>
-              </w:rPr>
-            </w:r>
-            <w:r>
-              <w:rPr>
-                <w:rFonts w:ascii="Tahoma" w:hAnsi="Tahoma" w:cs="Tahoma"/>
-                <w:sz w:val="20"/>
-                <w:szCs w:val="20"/>
-              </w:rPr>
-              <w:t>advisory — นักบินตัดสินใจ</w:t>
-            </w:r>
-          </w:p>
-        </w:tc>
-        <w:tc>
-          <w:tcPr>
-            <w:tcW w:type="dxa" w:w="3384"/>
-          </w:tcPr>
-          <w:p>
-            <w:r>
-              <w:rPr>
-                <w:rFonts w:ascii="Tahoma" w:hAnsi="Tahoma" w:cs="Tahoma"/>
-                <w:szCs w:val="21"/>
-              </w:rPr>
-            </w:r>
-            <w:r>
-              <w:rPr>
-                <w:rFonts w:ascii="Tahoma" w:hAnsi="Tahoma" w:cs="Tahoma"/>
-                <w:sz w:val="20"/>
-                <w:szCs w:val="20"/>
-              </w:rPr>
-              <w:t>advisory — client ตัดสินใจ</w:t>
-            </w:r>
-          </w:p>
-        </w:tc>
-      </w:tr>
-    </w:tbl>
-    <w:p>
-      <w:pPr>
-        <w:spacing w:after="80"/>
-      </w:pPr>
-    </w:p>
-    <w:p>
-      <w:pPr>
-        <w:pStyle w:val="Heading2"/>
-      </w:pPr>
-      <w:r>
-        <w:rPr>
-          <w:rFonts w:ascii="Tahoma" w:hAnsi="Tahoma" w:cs="Tahoma"/>
-          <w:szCs w:val="25"/>
-        </w:rPr>
-        <w:t>8.1 ข้อได้เปรียบของการออกแบบแบบรวมศูนย์</w:t>
-      </w:r>
-    </w:p>
-    <w:p>
-      <w:pPr>
-        <w:pStyle w:val="ListBullet"/>
-      </w:pPr>
-      <w:r>
-        <w:rPr>
-          <w:rFonts w:ascii="Tahoma" w:hAnsi="Tahoma" w:cs="Tahoma"/>
-          <w:b w:val="0"/>
-          <w:szCs w:val="21"/>
-        </w:rPr>
-      </w:r>
-      <w:r>
-        <w:rPr>
-          <w:rFonts w:ascii="Consolas" w:hAnsi="Consolas" w:cs="Tahoma"/>
-          <w:b/>
-          <w:szCs w:val="18"/>
-        </w:rPr>
-        <w:t>การประสาน RA ถูกต้องเสมอ</w:t>
-      </w:r>
-      <w:r>
-        <w:rPr>
-          <w:rFonts w:ascii="Tahoma" w:hAnsi="Tahoma" w:cs="Tahoma"/>
-          <w:b w:val="0"/>
-          <w:szCs w:val="21"/>
-        </w:rPr>
-        <w:t xml:space="preserve"> — TCAS จริงต้องอาศัยการเจรจาผ่านสัญญาณระหว่างเครื่องบิน ซึ่งมีความซับซ้อนและมีโอกาสประสานผิดพลาดจนหลบไปทางเดียวกัน แต่การให้ server ตัดสินทั้งคู่ในจุดเดียวรับประกันได้ว่าคำสั่งตรงข้ามกันเสมอ</w:t>
-      </w:r>
-    </w:p>
-    <w:p>
-      <w:pPr>
-        <w:pStyle w:val="ListBullet"/>
-      </w:pPr>
-      <w:r>
-        <w:rPr>
-          <w:rFonts w:ascii="Tahoma" w:hAnsi="Tahoma" w:cs="Tahoma"/>
-          <w:b w:val="0"/>
-          <w:szCs w:val="21"/>
-        </w:rPr>
-      </w:r>
-      <w:r>
-        <w:rPr>
-          <w:rFonts w:ascii="Tahoma" w:hAnsi="Tahoma" w:cs="Tahoma"/>
-          <w:b/>
-          <w:szCs w:val="21"/>
-        </w:rPr>
-        <w:t>มองเห็นภาพรวมทั้งหมด</w:t>
-      </w:r>
-      <w:r>
-        <w:rPr>
-          <w:rFonts w:ascii="Tahoma" w:hAnsi="Tahoma" w:cs="Tahoma"/>
-          <w:b w:val="0"/>
-          <w:szCs w:val="21"/>
-        </w:rPr>
-        <w:t xml:space="preserve"> — สามารถเลือกคู่ที่เสี่ยงที่สุดได้อย่างถูกต้อง ไม่ถูกจำกัดด้วยระยะการรับสัญญาณเหมือนระบบกระจาย</w:t>
-      </w:r>
-    </w:p>
-    <w:p>
-      <w:pPr>
-        <w:pStyle w:val="ListBullet"/>
-      </w:pPr>
-      <w:r>
-        <w:rPr>
-          <w:rFonts w:ascii="Tahoma" w:hAnsi="Tahoma" w:cs="Tahoma"/>
-          <w:b w:val="0"/>
-          <w:szCs w:val="21"/>
-        </w:rPr>
-      </w:r>
-      <w:r>
-        <w:rPr>
-          <w:rFonts w:ascii="Tahoma" w:hAnsi="Tahoma" w:cs="Tahoma"/>
-          <w:b/>
-          <w:szCs w:val="21"/>
-        </w:rPr>
-        <w:t>ตรวจสอบย้อนหลังได้</w:t>
-      </w:r>
-      <w:r>
-        <w:rPr>
-          <w:rFonts w:ascii="Tahoma" w:hAnsi="Tahoma" w:cs="Tahoma"/>
-          <w:b w:val="0"/>
-          <w:szCs w:val="21"/>
-        </w:rPr>
-        <w:t xml:space="preserve"> — ผลลัพธ์เป็น deterministic และมี log ครบทุกขั้น (RECV → CALC → SEND) ทำให้พิสูจน์ที่มาของการตัดสินใจได้ชัดเจน</w:t>
-      </w:r>
-    </w:p>
-    <w:p>
-      <w:pPr>
-        <w:pStyle w:val="Heading2"/>
-      </w:pPr>
-      <w:r>
-        <w:rPr>
-          <w:rFonts w:ascii="Tahoma" w:hAnsi="Tahoma" w:cs="Tahoma"/>
-          <w:szCs w:val="25"/>
-        </w:rPr>
-        <w:t>8.2 ข้อจำกัดที่ยอมรับ</w:t>
-      </w:r>
-    </w:p>
-    <w:p>
-      <w:pPr>
-        <w:pStyle w:val="ListBullet"/>
-      </w:pPr>
-      <w:r>
-        <w:rPr>
-          <w:rFonts w:ascii="Tahoma" w:hAnsi="Tahoma" w:cs="Tahoma"/>
-          <w:b w:val="0"/>
-          <w:szCs w:val="21"/>
-        </w:rPr>
-      </w:r>
-      <w:r>
-        <w:rPr>
-          <w:rFonts w:ascii="Tahoma" w:hAnsi="Tahoma" w:cs="Tahoma"/>
-          <w:b/>
-          <w:szCs w:val="21"/>
-        </w:rPr>
-        <w:t>False alarm จากการใช้ระยะคงที่</w:t>
-      </w:r>
-      <w:r>
-        <w:rPr>
-          <w:rFonts w:ascii="Tahoma" w:hAnsi="Tahoma" w:cs="Tahoma"/>
-          <w:b w:val="0"/>
-          <w:szCs w:val="21"/>
-        </w:rPr>
-        <w:t xml:space="preserve"> — เครื่องบินสองลำที่บินขนานกันในระยะ 1.5 nm จะได้รับ RA ต่อเนื่องทั้งที่ไม่มีแนวโน้มจะชน เพราะไม่ได้พิจารณาความเร็วและทิศทาง</w:t>
-      </w:r>
-    </w:p>
-    <w:p>
-      <w:pPr>
-        <w:pStyle w:val="ListBullet"/>
-      </w:pPr>
-      <w:r>
-        <w:rPr>
-          <w:rFonts w:ascii="Tahoma" w:hAnsi="Tahoma" w:cs="Tahoma"/>
-          <w:b w:val="0"/>
-          <w:szCs w:val="21"/>
-        </w:rPr>
-      </w:r>
-      <w:r>
-        <w:rPr>
-          <w:rFonts w:ascii="Tahoma" w:hAnsi="Tahoma" w:cs="Tahoma"/>
-          <w:b/>
-          <w:szCs w:val="21"/>
-        </w:rPr>
-        <w:t>Single point of failure</w:t>
-      </w:r>
-      <w:r>
-        <w:rPr>
-          <w:rFonts w:ascii="Tahoma" w:hAnsi="Tahoma" w:cs="Tahoma"/>
-          <w:b w:val="0"/>
-          <w:szCs w:val="21"/>
-        </w:rPr>
-        <w:t xml:space="preserve"> — หาก server หยุดทำงาน ระบบทั้งหมดจะไม่สามารถทำงานได้ ซึ่งเป็นข้อเสียที่ติดมากับสถาปัตยกรรมแบบรวมศูนย์</w:t>
-      </w:r>
-    </w:p>
-    <w:p>
-      <w:pPr>
-        <w:pStyle w:val="ListBullet"/>
-      </w:pPr>
-      <w:r>
-        <w:rPr>
-          <w:rFonts w:ascii="Tahoma" w:hAnsi="Tahoma" w:cs="Tahoma"/>
-          <w:b w:val="0"/>
-          <w:szCs w:val="21"/>
-        </w:rPr>
-      </w:r>
-      <w:r>
-        <w:rPr>
-          <w:rFonts w:ascii="Tahoma" w:hAnsi="Tahoma" w:cs="Tahoma"/>
-          <w:b/>
-          <w:szCs w:val="21"/>
-        </w:rPr>
-        <w:t>client ไม่มีการตรวจทานซ้ำ</w:t>
-      </w:r>
-      <w:r>
-        <w:rPr>
-          <w:rFonts w:ascii="Tahoma" w:hAnsi="Tahoma" w:cs="Tahoma"/>
-          <w:b w:val="0"/>
-          <w:szCs w:val="21"/>
-        </w:rPr>
-        <w:t xml:space="preserve"> — ต้องเชื่อผลการคำนวณของ server ทั้งหมด ต่างจากระบบกระจายที่แต่ละฝ่ายคำนวณเองและเทียบผลกันได้</w:t>
-      </w:r>
-    </w:p>
-    <w:p>
-      <w:pPr>
-        <w:pStyle w:val="Heading1"/>
-      </w:pPr>
-      <w:r>
-        <w:rPr>
-          <w:rFonts w:ascii="Tahoma" w:hAnsi="Tahoma" w:cs="Tahoma"/>
-          <w:szCs w:val="30"/>
-        </w:rPr>
-        <w:t>9. แนวทางพัฒนาต่อ</w:t>
-      </w:r>
-    </w:p>
-    <w:p>
-      <w:pPr>
-        <w:pStyle w:val="ListBullet"/>
-      </w:pPr>
-      <w:r>
-        <w:rPr>
-          <w:rFonts w:ascii="Tahoma" w:hAnsi="Tahoma" w:cs="Tahoma"/>
-          <w:b w:val="0"/>
-          <w:szCs w:val="21"/>
-        </w:rPr>
-        <w:t xml:space="preserve">เพิ่ม </w:t>
-      </w:r>
-      <w:r>
-        <w:rPr>
-          <w:rFonts w:ascii="Tahoma" w:hAnsi="Tahoma" w:cs="Tahoma"/>
-          <w:b/>
-          <w:szCs w:val="21"/>
-        </w:rPr>
-        <w:t>velocity vector</w:t>
-      </w:r>
-      <w:r>
-        <w:rPr>
-          <w:rFonts w:ascii="Tahoma" w:hAnsi="Tahoma" w:cs="Tahoma"/>
-          <w:b w:val="0"/>
-          <w:szCs w:val="21"/>
-        </w:rPr>
-        <w:t xml:space="preserve"> (ความเร็วและทิศทาง) เข้าไปใน request เพื่อให้ server คำนวณ time-to-CPA ได้จริง แทนการใช้ระยะคงที่ ซึ่งจะลด false alarm และเข้าใกล้หลักการของ TCAS จริงมากขึ้น</w:t>
-      </w:r>
-    </w:p>
-    <w:p>
-      <w:pPr>
-        <w:pStyle w:val="ListBullet"/>
-      </w:pPr>
-      <w:r>
-        <w:rPr>
-          <w:rFonts w:ascii="Tahoma" w:hAnsi="Tahoma" w:cs="Tahoma"/>
-          <w:b w:val="0"/>
-          <w:szCs w:val="21"/>
-        </w:rPr>
-        <w:t>รองรับเครื่องบินมากกว่าสองลำ โดยเปรียบเทียบทุกคู่ที่เป็นไปได้ แล้วเลือกภัยที่ใกล้ที่สุดมาตอบ</w:t>
-      </w:r>
-    </w:p>
-    <w:p>
-      <w:pPr>
-        <w:pStyle w:val="ListBullet"/>
-      </w:pPr>
-      <w:r>
-        <w:rPr>
-          <w:rFonts w:ascii="Tahoma" w:hAnsi="Tahoma" w:cs="Tahoma"/>
-          <w:b w:val="0"/>
-          <w:szCs w:val="21"/>
-        </w:rPr>
-        <w:t>เพิ่มกลไก timeout ฝั่ง server เพื่อลบเครื่องบินที่ขาดการติดต่อออกจาก radar โดยอัตโนมัติ</w:t>
-      </w:r>
-    </w:p>
-    <w:p>
-      <w:pPr>
-        <w:pStyle w:val="Heading1"/>
-      </w:pPr>
-      <w:r>
-        <w:rPr>
-          <w:rFonts w:ascii="Tahoma" w:hAnsi="Tahoma" w:cs="Tahoma"/>
-          <w:szCs w:val="30"/>
-        </w:rPr>
-        <w:t>ภาคผนวก: ไฟล์ในโปรเจกต์</w:t>
-      </w:r>
-    </w:p>
-    <w:tbl>
-      <w:tblPr>
-        <w:tblStyle w:val="TableGrid"/>
-        <w:tblW w:type="auto" w:w="0"/>
-        <w:jc w:val="center"/>
-        <w:tblLook w:firstColumn="1" w:firstRow="1" w:lastColumn="0" w:lastRow="0" w:noHBand="0" w:noVBand="1" w:val="04A0"/>
-      </w:tblPr>
-      <w:tblGrid>
-        <w:gridCol w:w="4320"/>
-        <w:gridCol w:w="4320"/>
-      </w:tblGrid>
-      <w:tr>
-        <w:tc>
-          <w:tcPr>
-            <w:tcW w:type="dxa" w:w="2736"/>
-            <w:shd w:fill="1F3B57"/>
-          </w:tcPr>
-          <w:p>
-            <w:r>
-              <w:rPr>
-                <w:rFonts w:ascii="Tahoma" w:hAnsi="Tahoma" w:cs="Tahoma"/>
-                <w:szCs w:val="21"/>
-              </w:rPr>
-            </w:r>
-            <w:r>
-              <w:rPr>
-                <w:rFonts w:ascii="Tahoma" w:hAnsi="Tahoma" w:cs="Tahoma"/>
-                <w:b/>
-                <w:color w:val="FFFFFF"/>
-                <w:sz w:val="20"/>
-                <w:szCs w:val="20"/>
-              </w:rPr>
-              <w:t>ไฟล์</w:t>
-            </w:r>
-          </w:p>
-        </w:tc>
-        <w:tc>
-          <w:tcPr>
-            <w:tcW w:type="dxa" w:w="5904"/>
-            <w:shd w:fill="1F3B57"/>
-          </w:tcPr>
-          <w:p>
-            <w:r>
-              <w:rPr>
-                <w:rFonts w:ascii="Tahoma" w:hAnsi="Tahoma" w:cs="Tahoma"/>
-                <w:szCs w:val="21"/>
-              </w:rPr>
-            </w:r>
-            <w:r>
-              <w:rPr>
-                <w:rFonts w:ascii="Tahoma" w:hAnsi="Tahoma" w:cs="Tahoma"/>
-                <w:b/>
-                <w:color w:val="FFFFFF"/>
-                <w:sz w:val="20"/>
-                <w:szCs w:val="20"/>
-              </w:rPr>
-              <w:t>หน้าที่</w:t>
-            </w:r>
-          </w:p>
-        </w:tc>
-      </w:tr>
-      <w:tr>
-        <w:tc>
-          <w:tcPr>
-            <w:tcW w:type="dxa" w:w="2736"/>
-          </w:tcPr>
-          <w:p>
-            <w:r>
-              <w:rPr>
-                <w:rFonts w:ascii="Tahoma" w:hAnsi="Tahoma" w:cs="Tahoma"/>
-                <w:szCs w:val="21"/>
-              </w:rPr>
-            </w:r>
-            <w:r>
-              <w:rPr>
-                <w:rFonts w:ascii="Tahoma" w:hAnsi="Tahoma" w:cs="Tahoma"/>
-                <w:sz w:val="20"/>
-                <w:szCs w:val="20"/>
-              </w:rPr>
-              <w:t>tcasServer.py</w:t>
-            </w:r>
-          </w:p>
-        </w:tc>
-        <w:tc>
-          <w:tcPr>
-            <w:tcW w:type="dxa" w:w="5904"/>
-          </w:tcPr>
-          <w:p>
-            <w:r>
-              <w:rPr>
-                <w:rFonts w:ascii="Tahoma" w:hAnsi="Tahoma" w:cs="Tahoma"/>
-                <w:szCs w:val="21"/>
-              </w:rPr>
-            </w:r>
-            <w:r>
-              <w:rPr>
-                <w:rFonts w:ascii="Tahoma" w:hAnsi="Tahoma" w:cs="Tahoma"/>
-                <w:sz w:val="20"/>
-                <w:szCs w:val="20"/>
-              </w:rPr>
-              <w:t>UDP server รับ PING ประเมินความเสี่ยง และตอบคำสั่ง</w:t>
-            </w:r>
-          </w:p>
-        </w:tc>
-      </w:tr>
-      <w:tr>
-        <w:tc>
-          <w:tcPr>
-            <w:tcW w:type="dxa" w:w="2736"/>
-          </w:tcPr>
-          <w:p>
-            <w:r>
-              <w:rPr>
-                <w:rFonts w:ascii="Tahoma" w:hAnsi="Tahoma" w:cs="Tahoma"/>
-                <w:szCs w:val="21"/>
-              </w:rPr>
-            </w:r>
-            <w:r>
-              <w:rPr>
-                <w:rFonts w:ascii="Tahoma" w:hAnsi="Tahoma" w:cs="Tahoma"/>
-                <w:sz w:val="20"/>
-                <w:szCs w:val="20"/>
-              </w:rPr>
-              <w:t>tcasClient1.py</w:t>
-            </w:r>
-          </w:p>
-        </w:tc>
-        <w:tc>
-          <w:tcPr>
-            <w:tcW w:type="dxa" w:w="5904"/>
-          </w:tcPr>
-          <w:p>
-            <w:r>
-              <w:rPr>
-                <w:rFonts w:ascii="Tahoma" w:hAnsi="Tahoma" w:cs="Tahoma"/>
-                <w:szCs w:val="21"/>
-              </w:rPr>
-            </w:r>
-            <w:r>
-              <w:rPr>
-                <w:rFonts w:ascii="Tahoma" w:hAnsi="Tahoma" w:cs="Tahoma"/>
-                <w:sz w:val="20"/>
-                <w:szCs w:val="20"/>
-              </w:rPr>
-              <w:t>เครื่องบิน FD3020 — ปฏิบัติตามคำสั่ง RA</w:t>
-            </w:r>
-          </w:p>
-        </w:tc>
-      </w:tr>
-      <w:tr>
-        <w:tc>
-          <w:tcPr>
-            <w:tcW w:type="dxa" w:w="2736"/>
-          </w:tcPr>
-          <w:p>
-            <w:r>
-              <w:rPr>
-                <w:rFonts w:ascii="Tahoma" w:hAnsi="Tahoma" w:cs="Tahoma"/>
-                <w:szCs w:val="21"/>
-              </w:rPr>
-            </w:r>
-            <w:r>
-              <w:rPr>
-                <w:rFonts w:ascii="Tahoma" w:hAnsi="Tahoma" w:cs="Tahoma"/>
-                <w:sz w:val="20"/>
-                <w:szCs w:val="20"/>
-              </w:rPr>
-              <w:t>tcasClient2.py</w:t>
-            </w:r>
-          </w:p>
-        </w:tc>
-        <w:tc>
-          <w:tcPr>
-            <w:tcW w:type="dxa" w:w="5904"/>
-          </w:tcPr>
-          <w:p>
-            <w:r>
-              <w:rPr>
-                <w:rFonts w:ascii="Tahoma" w:hAnsi="Tahoma" w:cs="Tahoma"/>
-                <w:szCs w:val="21"/>
-              </w:rPr>
-            </w:r>
-            <w:r>
-              <w:rPr>
-                <w:rFonts w:ascii="Tahoma" w:hAnsi="Tahoma" w:cs="Tahoma"/>
-                <w:sz w:val="20"/>
-                <w:szCs w:val="20"/>
-              </w:rPr>
-              <w:t>เครื่องบิน TG611 — ปฏิบัติตามคำสั่ง RA</w:t>
-            </w:r>
-          </w:p>
-        </w:tc>
-      </w:tr>
-      <w:tr>
-        <w:tc>
-          <w:tcPr>
-            <w:tcW w:type="dxa" w:w="2736"/>
-          </w:tcPr>
-          <w:p>
-            <w:r>
-              <w:rPr>
-                <w:rFonts w:ascii="Tahoma" w:hAnsi="Tahoma" w:cs="Tahoma"/>
-                <w:szCs w:val="21"/>
-              </w:rPr>
-            </w:r>
-            <w:r>
-              <w:rPr>
-                <w:rFonts w:ascii="Tahoma" w:hAnsi="Tahoma" w:cs="Tahoma"/>
-                <w:sz w:val="20"/>
-                <w:szCs w:val="20"/>
-              </w:rPr>
-              <w:t>tcasCrashClient1.py</w:t>
-            </w:r>
-          </w:p>
-        </w:tc>
-        <w:tc>
-          <w:tcPr>
-            <w:tcW w:type="dxa" w:w="5904"/>
-          </w:tcPr>
-          <w:p>
-            <w:r>
-              <w:rPr>
-                <w:rFonts w:ascii="Tahoma" w:hAnsi="Tahoma" w:cs="Tahoma"/>
-                <w:szCs w:val="21"/>
-              </w:rPr>
-            </w:r>
-            <w:r>
-              <w:rPr>
-                <w:rFonts w:ascii="Tahoma" w:hAnsi="Tahoma" w:cs="Tahoma"/>
-                <w:sz w:val="20"/>
-                <w:szCs w:val="20"/>
-              </w:rPr>
-              <w:t>เครื่องบิน CC201 — เพิกเฉยต่อ RA (ทดสอบการชน)</w:t>
-            </w:r>
-          </w:p>
-        </w:tc>
-      </w:tr>
-      <w:tr>
-        <w:tc>
-          <w:tcPr>
-            <w:tcW w:type="dxa" w:w="2736"/>
-          </w:tcPr>
-          <w:p>
-            <w:r>
-              <w:rPr>
-                <w:rFonts w:ascii="Tahoma" w:hAnsi="Tahoma" w:cs="Tahoma"/>
-                <w:szCs w:val="21"/>
-              </w:rPr>
-            </w:r>
-            <w:r>
-              <w:rPr>
-                <w:rFonts w:ascii="Tahoma" w:hAnsi="Tahoma" w:cs="Tahoma"/>
-                <w:sz w:val="20"/>
-                <w:szCs w:val="20"/>
-              </w:rPr>
-              <w:t>tcasCrashClient2.py</w:t>
-            </w:r>
-          </w:p>
-        </w:tc>
-        <w:tc>
-          <w:tcPr>
-            <w:tcW w:type="dxa" w:w="5904"/>
-          </w:tcPr>
-          <w:p>
-            <w:r>
-              <w:rPr>
-                <w:rFonts w:ascii="Tahoma" w:hAnsi="Tahoma" w:cs="Tahoma"/>
-                <w:szCs w:val="21"/>
-              </w:rPr>
-            </w:r>
-            <w:r>
-              <w:rPr>
-                <w:rFonts w:ascii="Tahoma" w:hAnsi="Tahoma" w:cs="Tahoma"/>
-                <w:sz w:val="20"/>
-                <w:szCs w:val="20"/>
-              </w:rPr>
-              <w:t>เครื่องบิน CC202 — เพิกเฉยต่อ RA (ทดสอบการชน)</w:t>
-            </w:r>
-          </w:p>
-        </w:tc>
-      </w:tr>
-      <w:tr>
-        <w:tc>
-          <w:tcPr>
-            <w:tcW w:type="dxa" w:w="2736"/>
-          </w:tcPr>
-          <w:p>
-            <w:r>
-              <w:rPr>
-                <w:rFonts w:ascii="Tahoma" w:hAnsi="Tahoma" w:cs="Tahoma"/>
-                <w:szCs w:val="21"/>
-              </w:rPr>
-            </w:r>
-            <w:r>
-              <w:rPr>
-                <w:rFonts w:ascii="Tahoma" w:hAnsi="Tahoma" w:cs="Tahoma"/>
-                <w:sz w:val="20"/>
-                <w:szCs w:val="20"/>
-              </w:rPr>
-              <w:t>IdeaSummarized.md</w:t>
-            </w:r>
-          </w:p>
-        </w:tc>
-        <w:tc>
-          <w:tcPr>
-            <w:tcW w:type="dxa" w:w="5904"/>
-          </w:tcPr>
-          <w:p>
-            <w:r>
-              <w:rPr>
-                <w:rFonts w:ascii="Tahoma" w:hAnsi="Tahoma" w:cs="Tahoma"/>
-                <w:szCs w:val="21"/>
-              </w:rPr>
-            </w:r>
-            <w:r>
-              <w:rPr>
-                <w:rFonts w:ascii="Tahoma" w:hAnsi="Tahoma" w:cs="Tahoma"/>
-                <w:sz w:val="20"/>
-                <w:szCs w:val="20"/>
-              </w:rPr>
-              <w:t>เอกสารสรุปข้อกำหนดของโปรโตคอล</w:t>
-            </w:r>
-          </w:p>
-        </w:tc>
-      </w:tr>
-    </w:tbl>
-    <w:p>
-      <w:pPr>
-        <w:spacing w:after="80"/>
-      </w:pPr>
-    </w:p>
-    <w:p>
-      <w:pPr>
-        <w:pStyle w:val="Heading2"/>
-      </w:pPr>
-      <w:r>
-        <w:rPr>
-          <w:rFonts w:ascii="Tahoma" w:hAnsi="Tahoma" w:cs="Tahoma"/>
-          <w:szCs w:val="25"/>
-        </w:rPr>
-        <w:t>วิธีการรัน</w:t>
-      </w:r>
-    </w:p>
-    <w:p>
-      <w:pPr>
-        <w:pStyle w:val="CodeBlock"/>
-        <w:spacing w:after="0" w:before="0"/>
-      </w:pPr>
-      <w:r>
-        <w:rPr>
-          <w:rFonts w:ascii="Consolas" w:hAnsi="Consolas" w:cs="Tahoma"/>
-          <w:szCs w:val="18"/>
-        </w:rPr>
-        <w:t># กรณีหลบหลีกสำเร็จ</w:t>
-      </w:r>
-    </w:p>
-    <w:p>
-      <w:pPr>
-        <w:pStyle w:val="CodeBlock"/>
-        <w:spacing w:after="0" w:before="0"/>
-      </w:pPr>
-      <w:r>
-        <w:rPr>
-          <w:rFonts w:ascii="Consolas" w:hAnsi="Consolas" w:cs="Tahoma"/>
-          <w:szCs w:val="18"/>
-        </w:rPr>
-        <w:t>python3 tcasServer.py          # terminal 1</w:t>
-      </w:r>
-    </w:p>
-    <w:p>
-      <w:pPr>
-        <w:pStyle w:val="CodeBlock"/>
-        <w:spacing w:after="0" w:before="0"/>
-      </w:pPr>
-      <w:r>
-        <w:rPr>
-          <w:rFonts w:ascii="Consolas" w:hAnsi="Consolas" w:cs="Tahoma"/>
-          <w:szCs w:val="18"/>
-        </w:rPr>
-        <w:t>python3 tcasClient1.py         # terminal 2</w:t>
-      </w:r>
-    </w:p>
-    <w:p>
-      <w:pPr>
-        <w:pStyle w:val="CodeBlock"/>
-        <w:spacing w:after="0" w:before="0"/>
-      </w:pPr>
-      <w:r>
-        <w:rPr>
-          <w:rFonts w:ascii="Consolas" w:hAnsi="Consolas" w:cs="Tahoma"/>
-          <w:szCs w:val="18"/>
-        </w:rPr>
-        <w:t>python3 tcasClient2.py         # terminal 3</w:t>
-      </w:r>
-    </w:p>
-    <w:p>
-      <w:pPr>
-        <w:pStyle w:val="CodeBlock"/>
-        <w:spacing w:after="0" w:before="0"/>
-      </w:pPr>
-    </w:p>
-    <w:p>
-      <w:pPr>
-        <w:pStyle w:val="CodeBlock"/>
-        <w:spacing w:after="0" w:before="0"/>
-      </w:pPr>
-      <w:r>
-        <w:rPr>
-          <w:rFonts w:ascii="Consolas" w:hAnsi="Consolas" w:cs="Tahoma"/>
-          <w:szCs w:val="18"/>
-        </w:rPr>
-        <w:t># กรณีเกิดการชน</w:t>
-      </w:r>
-    </w:p>
-    <w:p>
-      <w:pPr>
-        <w:pStyle w:val="CodeBlock"/>
-        <w:spacing w:after="0" w:before="0"/>
-      </w:pPr>
-      <w:r>
-        <w:rPr>
-          <w:rFonts w:ascii="Consolas" w:hAnsi="Consolas" w:cs="Tahoma"/>
-          <w:szCs w:val="18"/>
-        </w:rPr>
-        <w:t>python3 tcasServer.py          # terminal 1</w:t>
-      </w:r>
-    </w:p>
-    <w:p>
-      <w:pPr>
-        <w:pStyle w:val="CodeBlock"/>
-        <w:spacing w:after="0" w:before="0"/>
-      </w:pPr>
-      <w:r>
-        <w:rPr>
-          <w:rFonts w:ascii="Consolas" w:hAnsi="Consolas" w:cs="Tahoma"/>
-          <w:szCs w:val="18"/>
-        </w:rPr>
-        <w:t>python3 tcasCrashClient1.py    # terminal 2</w:t>
-      </w:r>
-    </w:p>
-    <w:p>
-      <w:pPr>
-        <w:pStyle w:val="CodeBlock"/>
-        <w:spacing w:after="0" w:before="0"/>
-      </w:pPr>
-      <w:r>
-        <w:rPr>
-          <w:rFonts w:ascii="Consolas" w:hAnsi="Consolas" w:cs="Tahoma"/>
-          <w:szCs w:val="18"/>
-        </w:rPr>
-        <w:t>python3 tcasCrashClient2.py    # terminal 3</w:t>
-      </w:r>
-    </w:p>
-    <w:p>
-      <w:pPr>
-        <w:spacing w:after="80"/>
-      </w:pPr>
     </w:p>
     <w:sectPr>
       <w:pgSz w:w="12240" w:h="15840"/>
@@ -3711,8 +1239,8 @@
     <w:qFormat/>
     <w:rsid w:val="00FC693F"/>
     <w:rPr>
-      <w:rFonts w:ascii="Tahoma" w:hAnsi="Tahoma" w:cs="Tahoma"/>
-      <w:sz w:val="21"/>
+      <w:rFonts w:ascii="TH Sarabun New" w:hAnsi="TH Sarabun New"/>
+      <w:sz w:val="32"/>
     </w:rPr>
   </w:style>
   <w:style w:type="paragraph" w:styleId="Header">
@@ -3774,11 +1302,11 @@
       <w:outlineLvl w:val="0"/>
     </w:pPr>
     <w:rPr>
-      <w:rFonts w:asciiTheme="majorHAnsi" w:eastAsiaTheme="majorEastAsia" w:hAnsiTheme="majorHAnsi" w:cstheme="majorBidi" w:ascii="Tahoma" w:hAnsi="Tahoma" w:cs="Tahoma"/>
+      <w:rFonts w:asciiTheme="majorHAnsi" w:eastAsiaTheme="majorEastAsia" w:hAnsiTheme="majorHAnsi" w:cstheme="majorBidi"/>
       <w:b/>
       <w:bCs/>
-      <w:color w:val="1F3B57"/>
-      <w:sz w:val="30"/>
+      <w:color w:val="365F91" w:themeColor="accent1" w:themeShade="BF"/>
+      <w:sz w:val="28"/>
       <w:szCs w:val="28"/>
     </w:rPr>
   </w:style>
@@ -3798,11 +1326,11 @@
       <w:outlineLvl w:val="1"/>
     </w:pPr>
     <w:rPr>
-      <w:rFonts w:asciiTheme="majorHAnsi" w:eastAsiaTheme="majorEastAsia" w:hAnsiTheme="majorHAnsi" w:cstheme="majorBidi" w:ascii="Tahoma" w:hAnsi="Tahoma" w:cs="Tahoma"/>
+      <w:rFonts w:asciiTheme="majorHAnsi" w:eastAsiaTheme="majorEastAsia" w:hAnsiTheme="majorHAnsi" w:cstheme="majorBidi"/>
       <w:b/>
       <w:bCs/>
-      <w:color w:val="1F3B57"/>
-      <w:sz w:val="25"/>
+      <w:color w:val="4F81BD" w:themeColor="accent1"/>
+      <w:sz w:val="26"/>
       <w:szCs w:val="26"/>
     </w:rPr>
   </w:style>
@@ -15396,17 +12924,6 @@
         <w:shd w:val="clear" w:color="auto" w:fill="FBCAA2" w:themeFill="accent6" w:themeFillTint="7F"/>
       </w:tcPr>
     </w:tblStylePr>
-  </w:style>
-  <w:style w:type="paragraph" w:customStyle="1" w:styleId="CodeBlock">
-    <w:name w:val="CodeBlock"/>
-    <w:pPr>
-      <w:spacing w:before="80" w:after="160"/>
-      <w:ind w:left="360"/>
-    </w:pPr>
-    <w:rPr>
-      <w:rFonts w:ascii="Consolas" w:hAnsi="Consolas"/>
-      <w:sz w:val="18"/>
-    </w:rPr>
   </w:style>
 </w:styles>
 </file>

</xml_diff>